<commit_message>
Added on 14th Mar 2026
</commit_message>
<xml_diff>
--- a/Raja_Dinakaran_CV.docx
+++ b/Raja_Dinakaran_CV.docx
@@ -217,24 +217,6 @@
           <w:sz w:val="20"/>
         </w:rPr>
         <w:t xml:space="preserve"> </w:t>
-      </w:r>
-    </w:p>
-    <w:p>
-      <w:pPr>
-        <w:pStyle w:val="Normal"/>
-        <w:spacing w:before="0" w:after="32"/>
-        <w:rPr>
-          <w:rFonts w:ascii="Arial" w:hAnsi="Arial" w:eastAsia="Arial" w:cs="Arial"/>
-          <w:color w:val="404040"/>
-          <w:sz w:val="20"/>
-        </w:rPr>
-      </w:pPr>
-      <w:r>
-        <w:rPr>
-          <w:rFonts w:eastAsia="Arial" w:cs="Arial" w:ascii="Arial" w:hAnsi="Arial"/>
-          <w:color w:val="404040"/>
-          <w:sz w:val="20"/>
-        </w:rPr>
       </w:r>
     </w:p>
     <w:p>
@@ -349,7 +331,31 @@
                 <w:szCs w:val="20"/>
                 <w:lang w:val="en-US" w:eastAsia="en-US" w:bidi="ar-SA"/>
               </w:rPr>
-              <w:t>Visual Studio 6.0, VB6.0, ASP, XML/HTML/DHTML,CSS, Microsoft Enterprise Library</w:t>
+              <w:t>Visual Studio 6.0, ASP.</w:t>
+            </w:r>
+            <w:r>
+              <w:rPr>
+                <w:rFonts w:eastAsia="Calibri" w:cs="Aptos" w:ascii="arial" w:hAnsi="arial" w:cstheme="minorHAnsi"/>
+                <w:b w:val="false"/>
+                <w:bCs/>
+                <w:kern w:val="0"/>
+                <w:sz w:val="20"/>
+                <w:szCs w:val="20"/>
+                <w:lang w:val="en-US" w:eastAsia="en-US" w:bidi="ar-SA"/>
+              </w:rPr>
+              <w:t>NET</w:t>
+            </w:r>
+            <w:r>
+              <w:rPr>
+                <w:rFonts w:eastAsia="Calibri" w:cs="Aptos" w:ascii="arial" w:hAnsi="arial" w:cstheme="minorHAnsi"/>
+                <w:b w:val="false"/>
+                <w:bCs/>
+                <w:kern w:val="0"/>
+                <w:sz w:val="20"/>
+                <w:szCs w:val="20"/>
+                <w:lang w:val="en-US" w:eastAsia="en-US" w:bidi="ar-SA"/>
+              </w:rPr>
+              <w:t>, XML/HTML/DHTML,CSS, Microsoft Enterprise Library</w:t>
             </w:r>
           </w:p>
         </w:tc>
@@ -391,20 +397,7 @@
                 <w:szCs w:val="20"/>
                 <w:lang w:val="en-US" w:eastAsia="en-US" w:bidi="ar-SA"/>
               </w:rPr>
-              <w:t>Scripting Languages</w:t>
-            </w:r>
-            <w:r>
-              <w:rPr>
-                <w:rFonts w:eastAsia="Calibri" w:cs="Arial" w:ascii="arial" w:hAnsi="arial"/>
-                <w:b/>
-                <w:bCs/>
-                <w:i/>
-                <w:kern w:val="0"/>
-                <w:sz w:val="20"/>
-                <w:szCs w:val="20"/>
-                <w:lang w:val="en-US" w:eastAsia="en-US" w:bidi="ar-SA"/>
-              </w:rPr>
-              <w:t xml:space="preserve"> /Libraries</w:t>
+              <w:t>Scripting Languages /Libraries</w:t>
             </w:r>
           </w:p>
         </w:tc>
@@ -438,105 +431,7 @@
                 <w:szCs w:val="20"/>
                 <w:lang w:val="en-US" w:eastAsia="en-US" w:bidi="ar-SA"/>
               </w:rPr>
-              <w:t>JavaScript, J</w:t>
-            </w:r>
-            <w:r>
-              <w:rPr>
-                <w:rFonts w:eastAsia="Calibri" w:cs="Aptos" w:ascii="arial" w:hAnsi="arial" w:cstheme="minorHAnsi"/>
-                <w:b w:val="false"/>
-                <w:bCs/>
-                <w:kern w:val="0"/>
-                <w:sz w:val="20"/>
-                <w:szCs w:val="20"/>
-                <w:lang w:val="en-US" w:eastAsia="en-US" w:bidi="ar-SA"/>
-              </w:rPr>
-              <w:t xml:space="preserve">query, React JS, Node JS, </w:t>
-            </w:r>
-            <w:r>
-              <w:rPr>
-                <w:rFonts w:eastAsia="Calibri" w:cs="Aptos" w:ascii="arial" w:hAnsi="arial" w:cstheme="minorHAnsi"/>
-                <w:b w:val="false"/>
-                <w:bCs/>
-                <w:kern w:val="0"/>
-                <w:sz w:val="20"/>
-                <w:szCs w:val="20"/>
-                <w:lang w:val="en-US" w:eastAsia="en-US" w:bidi="ar-SA"/>
-              </w:rPr>
-              <w:t>Perl Script</w:t>
-            </w:r>
-          </w:p>
-        </w:tc>
-      </w:tr>
-      <w:tr>
-        <w:trPr/>
-        <w:tc>
-          <w:tcPr>
-            <w:tcW w:w="3059" w:type="dxa"/>
-            <w:cnfStyle w:val="001000000000" w:firstRow="0" w:lastRow="0" w:firstColumn="1" w:lastColumn="0" w:oddVBand="0" w:evenVBand="0" w:oddHBand="0" w:evenHBand="0" w:firstRowFirstColumn="0" w:firstRowLastColumn="0" w:lastRowFirstColumn="0" w:lastRowLastColumn="0"/>
-            <w:tcBorders/>
-            <w:vAlign w:val="center"/>
-          </w:tcPr>
-          <w:p>
-            <w:pPr>
-              <w:pStyle w:val="Normal"/>
-              <w:widowControl w:val="false"/>
-              <w:spacing w:lineRule="auto" w:line="240" w:before="0" w:after="0"/>
-              <w:jc w:val="right"/>
-              <w:rPr>
-                <w:rFonts w:ascii="arial" w:hAnsi="arial" w:eastAsia="Calibri"/>
-                <w:b/>
-                <w:b/>
-                <w:bCs/>
-                <w:kern w:val="0"/>
-                <w:lang w:val="en-US" w:eastAsia="en-US" w:bidi="ar-SA"/>
-              </w:rPr>
-            </w:pPr>
-            <w:r>
-              <w:rPr>
-                <w:rFonts w:eastAsia="Calibri" w:cs="Arial" w:ascii="arial" w:hAnsi="arial"/>
-                <w:b/>
-                <w:bCs/>
-                <w:i/>
-                <w:kern w:val="0"/>
-                <w:sz w:val="20"/>
-                <w:szCs w:val="20"/>
-                <w:lang w:val="en-US" w:eastAsia="en-US" w:bidi="ar-SA"/>
-              </w:rPr>
-              <w:t>IOC</w:t>
-            </w:r>
-          </w:p>
-        </w:tc>
-        <w:tc>
-          <w:tcPr>
-            <w:tcW w:w="6300" w:type="dxa"/>
-            <w:cnfStyle w:val="000100000000" w:firstRow="0" w:lastRow="0" w:firstColumn="0" w:lastColumn="1" w:oddVBand="0" w:evenVBand="0" w:oddHBand="0" w:evenHBand="0" w:firstRowFirstColumn="0" w:firstRowLastColumn="0" w:lastRowFirstColumn="0" w:lastRowLastColumn="0"/>
-            <w:tcBorders/>
-            <w:vAlign w:val="center"/>
-          </w:tcPr>
-          <w:p>
-            <w:pPr>
-              <w:pStyle w:val="Normal"/>
-              <w:widowControl w:val="false"/>
-              <w:spacing w:lineRule="auto" w:line="240" w:before="0" w:after="0"/>
-              <w:jc w:val="left"/>
-              <w:rPr>
-                <w:rFonts w:ascii="arial" w:hAnsi="arial" w:eastAsia="Calibri"/>
-                <w:bCs/>
-                <w:kern w:val="0"/>
-                <w:lang w:val="en-US" w:eastAsia="en-US" w:bidi="ar-SA"/>
-              </w:rPr>
-            </w:pPr>
-            <w:r>
-              <w:rPr>
-                <w:rFonts w:eastAsia="Calibri" w:cs="Aptos" w:ascii="arial" w:hAnsi="arial" w:cstheme="minorHAnsi"/>
-                <w:b w:val="false"/>
-                <w:bCs/>
-                <w:kern w:val="0"/>
-                <w:sz w:val="20"/>
-                <w:szCs w:val="20"/>
-                <w:lang w:val="en-US" w:eastAsia="en-US" w:bidi="ar-SA"/>
-              </w:rPr>
-              <w:t>Structure Map, Castle Windsor</w:t>
+              <w:t>JavaScript, Jquery, React JS, Node JS, Perl Script</w:t>
             </w:r>
           </w:p>
         </w:tc>
@@ -607,7 +502,7 @@
                 <w:szCs w:val="20"/>
                 <w:lang w:val="en-US" w:eastAsia="en-US" w:bidi="ar-SA"/>
               </w:rPr>
-              <w:t>C#, VB.NET, Visual Studio .NET 2005/2008/2010, WinForms, Windows Presentation Foundation (WPF), Web Service, Windows Communication Foundation (WCF), REST, Web API, ASP.NET web forms, MVC, Web API, AJAX, Console Applications, .NET CORE, .NET Framework 4.6/4.5/4.0/3.5/2.0/1.1/1.0, .Net Standard 2.0, VSTS, TFS, .NET Assemblies.</w:t>
+              <w:t>C#, VB.NET, Visual Studio .NET 2005/2008/2010, WinForms, Windows Presentation Foundation (WPF), Web Service, Windows Communication Foundation (WCF), REST, Web API, ASP.NET web forms, MVC, Web API, AJAX, Console Applications, .NET CORE, .NET Framework 4.6/4.5/4.0, .Net Standard 2.0, VSTS, TFS, .NET Assemblies.</w:t>
             </w:r>
           </w:p>
         </w:tc>
@@ -680,7 +575,7 @@
                 <w:szCs w:val="20"/>
                 <w:lang w:val="en-US" w:eastAsia="en-US" w:bidi="ar-SA"/>
               </w:rPr>
-              <w:t>Visual Studio Modeler, Microsoft Visio, Enterprise Architect (EA) and UML.</w:t>
+              <w:t>Microsoft Visio and UML.</w:t>
             </w:r>
           </w:p>
         </w:tc>
@@ -757,31 +652,7 @@
                 <w:szCs w:val="20"/>
                 <w:lang w:val="en-US" w:eastAsia="en-US" w:bidi="ar-SA"/>
               </w:rPr>
-              <w:t>SQL Server 2014/2008/2005, Oracle 11g/10g/9i, PL/SQL, Microsoft Access, Toad, MySQL, M</w:t>
-            </w:r>
-            <w:r>
-              <w:rPr>
-                <w:rFonts w:eastAsia="Calibri" w:cs="Aptos" w:ascii="arial" w:hAnsi="arial" w:cstheme="minorHAnsi"/>
-                <w:b/>
-                <w:bCs/>
-                <w:kern w:val="0"/>
-                <w:sz w:val="20"/>
-                <w:szCs w:val="20"/>
-                <w:lang w:val="en-US" w:eastAsia="en-US" w:bidi="ar-SA"/>
-              </w:rPr>
-              <w:t>ongo</w:t>
-            </w:r>
-            <w:r>
-              <w:rPr>
-                <w:rFonts w:eastAsia="Calibri" w:cs="Aptos" w:ascii="arial" w:hAnsi="arial" w:cstheme="minorHAnsi"/>
-                <w:b/>
-                <w:bCs/>
-                <w:kern w:val="0"/>
-                <w:sz w:val="20"/>
-                <w:szCs w:val="20"/>
-                <w:lang w:val="en-US" w:eastAsia="en-US" w:bidi="ar-SA"/>
-              </w:rPr>
-              <w:t>DB</w:t>
+              <w:t>SQL Server 2014/2008/2005, Oracle 11g/10g/9i, PL/SQL, Microsoft Access, Toad, MySQL, MongoDB</w:t>
             </w:r>
           </w:p>
         </w:tc>
@@ -854,19 +725,79 @@
                 <w:szCs w:val="20"/>
                 <w:lang w:val="en-US" w:eastAsia="en-US" w:bidi="ar-SA"/>
               </w:rPr>
-              <w:t xml:space="preserve">Git, Rational Team Concert, </w:t>
+              <w:t>Git, Rational Team Concert, VSS</w:t>
             </w:r>
+          </w:p>
+        </w:tc>
+      </w:tr>
+      <w:tr>
+        <w:trPr/>
+        <w:tc>
+          <w:tcPr>
+            <w:tcW w:w="3059" w:type="dxa"/>
+            <w:cnfStyle w:val="001000000000" w:firstRow="0" w:lastRow="0" w:firstColumn="1" w:lastColumn="0" w:oddVBand="0" w:evenVBand="0" w:oddHBand="0" w:evenHBand="0" w:firstRowFirstColumn="0" w:firstRowLastColumn="0" w:lastRowFirstColumn="0" w:lastRowLastColumn="0"/>
+            <w:tcBorders/>
+            <w:vAlign w:val="center"/>
+          </w:tcPr>
+          <w:p>
+            <w:pPr>
+              <w:pStyle w:val="Normal"/>
+              <w:widowControl w:val="false"/>
+              <w:spacing w:lineRule="auto" w:line="240" w:before="0" w:after="0"/>
+              <w:jc w:val="right"/>
+              <w:rPr>
+                <w:rFonts w:ascii="arial" w:hAnsi="arial" w:eastAsia="Calibri"/>
+                <w:b/>
+                <w:b/>
+                <w:kern w:val="0"/>
+                <w:lang w:val="en-US" w:eastAsia="en-US" w:bidi="ar-SA"/>
+              </w:rPr>
+            </w:pPr>
             <w:r>
               <w:rPr>
-                <w:rFonts w:eastAsia="Calibri" w:cs="Aptos" w:ascii="arial" w:hAnsi="arial" w:cstheme="minorHAnsi"/>
-                <w:b w:val="false"/>
-                <w:bCs/>
+                <w:rFonts w:eastAsia="Calibri" w:cs="Arial" w:ascii="arial" w:hAnsi="arial"/>
+                <w:b/>
+                <w:bCs w:val="false"/>
+                <w:i/>
                 <w:kern w:val="0"/>
                 <w:sz w:val="20"/>
                 <w:szCs w:val="20"/>
                 <w:lang w:val="en-US" w:eastAsia="en-US" w:bidi="ar-SA"/>
               </w:rPr>
-              <w:t>VSS</w:t>
+              <w:t>O/S and H/W</w:t>
+            </w:r>
+          </w:p>
+        </w:tc>
+        <w:tc>
+          <w:tcPr>
+            <w:tcW w:w="6300" w:type="dxa"/>
+            <w:cnfStyle w:val="000100000000" w:firstRow="0" w:lastRow="0" w:firstColumn="0" w:lastColumn="1" w:oddVBand="0" w:evenVBand="0" w:oddHBand="0" w:evenHBand="0" w:firstRowFirstColumn="0" w:firstRowLastColumn="0" w:lastRowFirstColumn="0" w:lastRowLastColumn="0"/>
+            <w:tcBorders/>
+            <w:vAlign w:val="center"/>
+          </w:tcPr>
+          <w:p>
+            <w:pPr>
+              <w:pStyle w:val="Normal"/>
+              <w:widowControl w:val="false"/>
+              <w:spacing w:lineRule="auto" w:line="240" w:before="0" w:after="0"/>
+              <w:jc w:val="left"/>
+              <w:rPr>
+                <w:rFonts w:ascii="arial" w:hAnsi="arial" w:eastAsia="Calibri"/>
+                <w:kern w:val="0"/>
+                <w:lang w:val="en-US" w:eastAsia="en-US" w:bidi="ar-SA"/>
+              </w:rPr>
+            </w:pPr>
+            <w:r>
+              <w:rPr>
+                <w:rFonts w:eastAsia="Calibri" w:cs="Aptos" w:ascii="arial" w:hAnsi="arial" w:cstheme="minorHAnsi"/>
+                <w:b w:val="false"/>
+                <w:bCs w:val="false"/>
+                <w:kern w:val="0"/>
+                <w:sz w:val="20"/>
+                <w:szCs w:val="20"/>
+                <w:lang w:val="en-US" w:eastAsia="en-US" w:bidi="ar-SA"/>
+              </w:rPr>
+              <w:t>Windows 11,10/7/2000/2003/XP</w:t>
             </w:r>
           </w:p>
         </w:tc>
@@ -907,177 +838,6 @@
                 <w:szCs w:val="20"/>
                 <w:lang w:val="en-US" w:eastAsia="en-US" w:bidi="ar-SA"/>
               </w:rPr>
-              <w:t>Technologies</w:t>
-            </w:r>
-          </w:p>
-        </w:tc>
-        <w:tc>
-          <w:tcPr>
-            <w:tcW w:w="6300" w:type="dxa"/>
-            <w:cnfStyle w:val="000100000000" w:firstRow="0" w:lastRow="0" w:firstColumn="0" w:lastColumn="1" w:oddVBand="0" w:evenVBand="0" w:oddHBand="0" w:evenHBand="0" w:firstRowFirstColumn="0" w:firstRowLastColumn="0" w:lastRowFirstColumn="0" w:lastRowLastColumn="0"/>
-            <w:tcBorders/>
-            <w:vAlign w:val="center"/>
-          </w:tcPr>
-          <w:p>
-            <w:pPr>
-              <w:pStyle w:val="Normal"/>
-              <w:widowControl w:val="false"/>
-              <w:spacing w:lineRule="auto" w:line="240" w:before="0" w:after="0"/>
-              <w:jc w:val="left"/>
-              <w:rPr>
-                <w:rFonts w:ascii="arial" w:hAnsi="arial" w:eastAsia="Calibri"/>
-                <w:bCs/>
-                <w:kern w:val="0"/>
-                <w:lang w:val="en-US" w:eastAsia="en-US" w:bidi="ar-SA"/>
-              </w:rPr>
-            </w:pPr>
-            <w:r>
-              <w:rPr>
-                <w:rFonts w:eastAsia="Calibri" w:cs="Aptos" w:ascii="arial" w:hAnsi="arial" w:cstheme="minorHAnsi"/>
-                <w:b w:val="false"/>
-                <w:bCs/>
-                <w:kern w:val="0"/>
-                <w:sz w:val="20"/>
-                <w:szCs w:val="20"/>
-                <w:lang w:val="en-US" w:eastAsia="en-US" w:bidi="ar-SA"/>
-              </w:rPr>
-              <w:t>ADO/RDO, DAO, OLEDB, ODBC, MTS/MSMQ/COM+/COM /DCOM/ORM</w:t>
-            </w:r>
-          </w:p>
-        </w:tc>
-      </w:tr>
-      <w:tr>
-        <w:trPr/>
-        <w:tc>
-          <w:tcPr>
-            <w:tcW w:w="3059" w:type="dxa"/>
-            <w:cnfStyle w:val="001000000000" w:firstRow="0" w:lastRow="0" w:firstColumn="1" w:lastColumn="0" w:oddVBand="0" w:evenVBand="0" w:oddHBand="0" w:evenHBand="0" w:firstRowFirstColumn="0" w:firstRowLastColumn="0" w:lastRowFirstColumn="0" w:lastRowLastColumn="0"/>
-            <w:tcBorders/>
-            <w:vAlign w:val="center"/>
-          </w:tcPr>
-          <w:p>
-            <w:pPr>
-              <w:pStyle w:val="Normal"/>
-              <w:widowControl w:val="false"/>
-              <w:spacing w:lineRule="auto" w:line="240" w:before="0" w:after="0"/>
-              <w:jc w:val="right"/>
-              <w:rPr>
-                <w:rFonts w:ascii="arial" w:hAnsi="arial" w:eastAsia="Calibri"/>
-                <w:b/>
-                <w:b/>
-                <w:kern w:val="0"/>
-                <w:lang w:val="en-US" w:eastAsia="en-US" w:bidi="ar-SA"/>
-              </w:rPr>
-            </w:pPr>
-            <w:r>
-              <w:rPr>
-                <w:rFonts w:eastAsia="Calibri" w:cs="Arial" w:ascii="arial" w:hAnsi="arial"/>
-                <w:b/>
-                <w:bCs w:val="false"/>
-                <w:i/>
-                <w:kern w:val="0"/>
-                <w:sz w:val="20"/>
-                <w:szCs w:val="20"/>
-                <w:lang w:val="en-US" w:eastAsia="en-US" w:bidi="ar-SA"/>
-              </w:rPr>
-              <w:t>O/S and H/W</w:t>
-            </w:r>
-          </w:p>
-        </w:tc>
-        <w:tc>
-          <w:tcPr>
-            <w:tcW w:w="6300" w:type="dxa"/>
-            <w:cnfStyle w:val="000100000000" w:firstRow="0" w:lastRow="0" w:firstColumn="0" w:lastColumn="1" w:oddVBand="0" w:evenVBand="0" w:oddHBand="0" w:evenHBand="0" w:firstRowFirstColumn="0" w:firstRowLastColumn="0" w:lastRowFirstColumn="0" w:lastRowLastColumn="0"/>
-            <w:tcBorders/>
-            <w:vAlign w:val="center"/>
-          </w:tcPr>
-          <w:p>
-            <w:pPr>
-              <w:pStyle w:val="Normal"/>
-              <w:widowControl w:val="false"/>
-              <w:spacing w:lineRule="auto" w:line="240" w:before="0" w:after="0"/>
-              <w:jc w:val="left"/>
-              <w:rPr>
-                <w:rFonts w:ascii="arial" w:hAnsi="arial" w:eastAsia="Calibri"/>
-                <w:kern w:val="0"/>
-                <w:lang w:val="en-US" w:eastAsia="en-US" w:bidi="ar-SA"/>
-              </w:rPr>
-            </w:pPr>
-            <w:r>
-              <w:rPr>
-                <w:rFonts w:eastAsia="Calibri" w:cs="Aptos" w:ascii="arial" w:hAnsi="arial" w:cstheme="minorHAnsi"/>
-                <w:b w:val="false"/>
-                <w:bCs w:val="false"/>
-                <w:kern w:val="0"/>
-                <w:sz w:val="20"/>
-                <w:szCs w:val="20"/>
-                <w:lang w:val="en-US" w:eastAsia="en-US" w:bidi="ar-SA"/>
-              </w:rPr>
-              <w:t xml:space="preserve">Windows </w:t>
-            </w:r>
-            <w:r>
-              <w:rPr>
-                <w:rFonts w:eastAsia="Calibri" w:cs="Aptos" w:ascii="arial" w:hAnsi="arial" w:cstheme="minorHAnsi"/>
-                <w:b w:val="false"/>
-                <w:bCs w:val="false"/>
-                <w:kern w:val="0"/>
-                <w:sz w:val="20"/>
-                <w:szCs w:val="20"/>
-                <w:lang w:val="en-US" w:eastAsia="en-US" w:bidi="ar-SA"/>
-              </w:rPr>
-              <w:t>11,</w:t>
-            </w:r>
-            <w:r>
-              <w:rPr>
-                <w:rFonts w:eastAsia="Calibri" w:cs="Aptos" w:ascii="arial" w:hAnsi="arial" w:cstheme="minorHAnsi"/>
-                <w:b w:val="false"/>
-                <w:bCs w:val="false"/>
-                <w:kern w:val="0"/>
-                <w:sz w:val="20"/>
-                <w:szCs w:val="20"/>
-                <w:lang w:val="en-US" w:eastAsia="en-US" w:bidi="ar-SA"/>
-              </w:rPr>
-              <w:t>10/7/2000/2003/XP/NT/98/95</w:t>
-            </w:r>
-          </w:p>
-        </w:tc>
-      </w:tr>
-      <w:tr>
-        <w:trPr>
-          <w:cnfStyle w:val="000000100000" w:firstRow="0" w:lastRow="0" w:firstColumn="0" w:lastColumn="0" w:oddVBand="0" w:evenVBand="0" w:oddHBand="1" w:evenHBand="0" w:firstRowFirstColumn="0" w:firstRowLastColumn="0" w:lastRowFirstColumn="0" w:lastRowLastColumn="0"/>
-        </w:trPr>
-        <w:tc>
-          <w:tcPr>
-            <w:tcW w:w="3059" w:type="dxa"/>
-            <w:cnfStyle w:val="001000000000" w:firstRow="0" w:lastRow="0" w:firstColumn="1" w:lastColumn="0" w:oddVBand="0" w:evenVBand="0" w:oddHBand="0" w:evenHBand="0" w:firstRowFirstColumn="0" w:firstRowLastColumn="0" w:lastRowFirstColumn="0" w:lastRowLastColumn="0"/>
-            <w:tcBorders/>
-            <w:vAlign w:val="center"/>
-          </w:tcPr>
-          <w:p>
-            <w:pPr>
-              <w:pStyle w:val="Normal"/>
-              <w:widowControl w:val="false"/>
-              <w:spacing w:lineRule="auto" w:line="240" w:before="0" w:after="0"/>
-              <w:jc w:val="right"/>
-              <w:rPr>
-                <w:rFonts w:ascii="arial" w:hAnsi="arial" w:eastAsia="Calibri"/>
-                <w:b/>
-                <w:b/>
-                <w:kern w:val="0"/>
-                <w:lang w:val="en-US" w:eastAsia="en-US" w:bidi="ar-SA"/>
-              </w:rPr>
-            </w:pPr>
-            <w:r>
-              <w:rPr>
-                <w:rFonts w:eastAsia="Calibri" w:cs="Arial" w:ascii="arial" w:hAnsi="arial"/>
-                <w:b/>
-                <w:bCs w:val="false"/>
-                <w:i/>
-                <w:kern w:val="0"/>
-                <w:sz w:val="20"/>
-                <w:szCs w:val="20"/>
-                <w:lang w:val="en-US" w:eastAsia="en-US" w:bidi="ar-SA"/>
-              </w:rPr>
               <w:t>Issue Tracking/Testing Tools</w:t>
             </w:r>
           </w:p>
@@ -1113,155 +873,6 @@
                 <w:lang w:val="en-US" w:eastAsia="en-US" w:bidi="ar-SA"/>
               </w:rPr>
               <w:t>Quality Center (QC), JIRA</w:t>
-            </w:r>
-          </w:p>
-        </w:tc>
-      </w:tr>
-      <w:tr>
-        <w:trPr/>
-        <w:tc>
-          <w:tcPr>
-            <w:tcW w:w="3059" w:type="dxa"/>
-            <w:cnfStyle w:val="001000000000" w:firstRow="0" w:lastRow="0" w:firstColumn="1" w:lastColumn="0" w:oddVBand="0" w:evenVBand="0" w:oddHBand="0" w:evenHBand="0" w:firstRowFirstColumn="0" w:firstRowLastColumn="0" w:lastRowFirstColumn="0" w:lastRowLastColumn="0"/>
-            <w:tcBorders/>
-            <w:vAlign w:val="center"/>
-          </w:tcPr>
-          <w:p>
-            <w:pPr>
-              <w:pStyle w:val="Normal"/>
-              <w:widowControl w:val="false"/>
-              <w:spacing w:lineRule="auto" w:line="240" w:before="0" w:after="0"/>
-              <w:jc w:val="right"/>
-              <w:rPr>
-                <w:rFonts w:ascii="arial" w:hAnsi="arial" w:eastAsia="Calibri"/>
-                <w:b/>
-                <w:b/>
-                <w:kern w:val="0"/>
-                <w:lang w:val="en-US" w:eastAsia="en-US" w:bidi="ar-SA"/>
-              </w:rPr>
-            </w:pPr>
-            <w:r>
-              <w:rPr>
-                <w:rFonts w:eastAsia="Calibri" w:cs="Arial" w:ascii="arial" w:hAnsi="arial"/>
-                <w:b/>
-                <w:bCs w:val="false"/>
-                <w:i/>
-                <w:kern w:val="0"/>
-                <w:sz w:val="20"/>
-                <w:szCs w:val="20"/>
-                <w:lang w:val="en-US" w:eastAsia="en-US" w:bidi="ar-SA"/>
-              </w:rPr>
-              <w:t>Cloud Computing</w:t>
-            </w:r>
-          </w:p>
-        </w:tc>
-        <w:tc>
-          <w:tcPr>
-            <w:tcW w:w="6300" w:type="dxa"/>
-            <w:cnfStyle w:val="000100000000" w:firstRow="0" w:lastRow="0" w:firstColumn="0" w:lastColumn="1" w:oddVBand="0" w:evenVBand="0" w:oddHBand="0" w:evenHBand="0" w:firstRowFirstColumn="0" w:firstRowLastColumn="0" w:lastRowFirstColumn="0" w:lastRowLastColumn="0"/>
-            <w:tcBorders/>
-            <w:vAlign w:val="center"/>
-          </w:tcPr>
-          <w:p>
-            <w:pPr>
-              <w:pStyle w:val="Normal"/>
-              <w:widowControl w:val="false"/>
-              <w:spacing w:lineRule="auto" w:line="240" w:before="0" w:after="0"/>
-              <w:jc w:val="left"/>
-              <w:rPr>
-                <w:rFonts w:ascii="arial" w:hAnsi="arial" w:eastAsia="Calibri"/>
-                <w:bCs/>
-                <w:kern w:val="0"/>
-                <w:lang w:val="en-US" w:eastAsia="en-US" w:bidi="ar-SA"/>
-              </w:rPr>
-            </w:pPr>
-            <w:r>
-              <w:rPr>
-                <w:rFonts w:eastAsia="Calibri" w:cs="Aptos" w:ascii="arial" w:hAnsi="arial" w:cstheme="minorHAnsi"/>
-                <w:b w:val="false"/>
-                <w:bCs/>
-                <w:kern w:val="0"/>
-                <w:sz w:val="20"/>
-                <w:szCs w:val="20"/>
-                <w:lang w:val="en-US" w:eastAsia="en-US" w:bidi="ar-SA"/>
-              </w:rPr>
-              <w:t>Exposure on SaaS, IaaS, PaaS</w:t>
-            </w:r>
-          </w:p>
-        </w:tc>
-      </w:tr>
-      <w:tr>
-        <w:trPr>
-          <w:trHeight w:val="70" w:hRule="atLeast"/>
-          <w:cnfStyle w:val="000000100000" w:firstRow="0" w:lastRow="0" w:firstColumn="0" w:lastColumn="0" w:oddVBand="0" w:evenVBand="0" w:oddHBand="1" w:evenHBand="0" w:firstRowFirstColumn="0" w:firstRowLastColumn="0" w:lastRowFirstColumn="0" w:lastRowLastColumn="0"/>
-        </w:trPr>
-        <w:tc>
-          <w:tcPr>
-            <w:tcW w:w="3059" w:type="dxa"/>
-            <w:cnfStyle w:val="001000000000" w:firstRow="0" w:lastRow="0" w:firstColumn="1" w:lastColumn="0" w:oddVBand="0" w:evenVBand="0" w:oddHBand="0" w:evenHBand="0" w:firstRowFirstColumn="0" w:firstRowLastColumn="0" w:lastRowFirstColumn="0" w:lastRowLastColumn="0"/>
-            <w:tcBorders/>
-            <w:vAlign w:val="center"/>
-          </w:tcPr>
-          <w:p>
-            <w:pPr>
-              <w:pStyle w:val="Normal"/>
-              <w:widowControl w:val="false"/>
-              <w:spacing w:lineRule="auto" w:line="240" w:before="0" w:after="0"/>
-              <w:jc w:val="right"/>
-              <w:rPr>
-                <w:rFonts w:ascii="arial" w:hAnsi="arial" w:eastAsia="Calibri"/>
-                <w:b/>
-                <w:b/>
-                <w:kern w:val="0"/>
-                <w:lang w:val="en-US" w:eastAsia="en-US" w:bidi="ar-SA"/>
-              </w:rPr>
-            </w:pPr>
-            <w:r>
-              <w:rPr>
-                <w:rFonts w:eastAsia="Calibri" w:cs="Arial" w:ascii="arial" w:hAnsi="arial"/>
-                <w:b/>
-                <w:bCs w:val="false"/>
-                <w:i/>
-                <w:kern w:val="0"/>
-                <w:sz w:val="20"/>
-                <w:szCs w:val="20"/>
-                <w:lang w:val="en-US" w:eastAsia="en-US" w:bidi="ar-SA"/>
-              </w:rPr>
-              <w:t>Third-Party Tools</w:t>
-            </w:r>
-          </w:p>
-        </w:tc>
-        <w:tc>
-          <w:tcPr>
-            <w:tcW w:w="6300" w:type="dxa"/>
-            <w:cnfStyle w:val="000100000000" w:firstRow="0" w:lastRow="0" w:firstColumn="0" w:lastColumn="1" w:oddVBand="0" w:evenVBand="0" w:oddHBand="0" w:evenHBand="0" w:firstRowFirstColumn="0" w:firstRowLastColumn="0" w:lastRowFirstColumn="0" w:lastRowLastColumn="0"/>
-            <w:tcBorders/>
-            <w:vAlign w:val="center"/>
-          </w:tcPr>
-          <w:p>
-            <w:pPr>
-              <w:pStyle w:val="Normal"/>
-              <w:widowControl w:val="false"/>
-              <w:spacing w:lineRule="auto" w:line="240" w:before="0" w:after="0"/>
-              <w:jc w:val="left"/>
-              <w:rPr>
-                <w:rFonts w:ascii="arial" w:hAnsi="arial" w:eastAsia="Calibri"/>
-                <w:bCs/>
-                <w:kern w:val="0"/>
-                <w:lang w:val="en-US" w:eastAsia="en-US" w:bidi="ar-SA"/>
-              </w:rPr>
-            </w:pPr>
-            <w:r>
-              <w:rPr>
-                <w:rFonts w:eastAsia="Calibri" w:cs="Aptos" w:ascii="arial" w:hAnsi="arial" w:cstheme="minorHAnsi"/>
-                <w:b w:val="false"/>
-                <w:bCs/>
-                <w:kern w:val="0"/>
-                <w:sz w:val="20"/>
-                <w:szCs w:val="20"/>
-                <w:lang w:val="en-US" w:eastAsia="en-US" w:bidi="ar-SA"/>
-              </w:rPr>
-              <w:t>DevExpress, Caliburn, ILOG, Infragistics, Xceed, K2, PeopleSoft</w:t>
             </w:r>
           </w:p>
         </w:tc>
@@ -1336,113 +947,8 @@
                 <w:szCs w:val="20"/>
                 <w:lang w:val="en-US" w:eastAsia="en-US" w:bidi="ar-SA"/>
               </w:rPr>
-              <w:t>Jenkins, VSTS</w:t>
+              <w:t>Jenkin</w:t>
             </w:r>
-          </w:p>
-        </w:tc>
-      </w:tr>
-      <w:tr>
-        <w:trPr>
-          <w:trHeight w:val="70" w:hRule="atLeast"/>
-          <w:cnfStyle w:val="010000000000" w:firstRow="0" w:lastRow="1" w:firstColumn="0" w:lastColumn="0" w:oddVBand="0" w:evenVBand="0" w:oddHBand="0" w:evenHBand="0" w:firstRowFirstColumn="0" w:firstRowLastColumn="0" w:lastRowFirstColumn="0" w:lastRowLastColumn="0"/>
-        </w:trPr>
-        <w:tc>
-          <w:tcPr>
-            <w:tcW w:w="3059" w:type="dxa"/>
-            <w:cnfStyle w:val="001000000000" w:firstRow="0" w:lastRow="0" w:firstColumn="1" w:lastColumn="0" w:oddVBand="0" w:evenVBand="0" w:oddHBand="0" w:evenHBand="0" w:firstRowFirstColumn="0" w:firstRowLastColumn="0" w:lastRowFirstColumn="0" w:lastRowLastColumn="0"/>
-            <w:tcBorders/>
-            <w:vAlign w:val="center"/>
-          </w:tcPr>
-          <w:p>
-            <w:pPr>
-              <w:pStyle w:val="Normal"/>
-              <w:widowControl w:val="false"/>
-              <w:spacing w:lineRule="auto" w:line="240" w:before="0" w:after="0"/>
-              <w:jc w:val="right"/>
-              <w:rPr>
-                <w:rFonts w:ascii="arial" w:hAnsi="arial" w:eastAsia="Calibri"/>
-                <w:b/>
-                <w:b/>
-                <w:kern w:val="0"/>
-                <w:lang w:val="en-US" w:eastAsia="en-US" w:bidi="ar-SA"/>
-              </w:rPr>
-            </w:pPr>
-            <w:r>
-              <w:rPr>
-                <w:rFonts w:eastAsia="Calibri" w:cs="Arial" w:ascii="arial" w:hAnsi="arial"/>
-                <w:b/>
-                <w:bCs w:val="false"/>
-                <w:i/>
-                <w:kern w:val="0"/>
-                <w:sz w:val="20"/>
-                <w:szCs w:val="20"/>
-                <w:lang w:val="en-US" w:eastAsia="en-US" w:bidi="ar-SA"/>
-              </w:rPr>
-              <w:t>Cloud Computing</w:t>
-            </w:r>
-          </w:p>
-        </w:tc>
-        <w:tc>
-          <w:tcPr>
-            <w:tcW w:w="6300" w:type="dxa"/>
-            <w:cnfStyle w:val="000100000000" w:firstRow="0" w:lastRow="0" w:firstColumn="0" w:lastColumn="1" w:oddVBand="0" w:evenVBand="0" w:oddHBand="0" w:evenHBand="0" w:firstRowFirstColumn="0" w:firstRowLastColumn="0" w:lastRowFirstColumn="0" w:lastRowLastColumn="0"/>
-            <w:tcBorders/>
-            <w:vAlign w:val="center"/>
-          </w:tcPr>
-          <w:p>
-            <w:pPr>
-              <w:pStyle w:val="Normal"/>
-              <w:widowControl w:val="false"/>
-              <w:spacing w:lineRule="auto" w:line="240" w:before="0" w:after="0"/>
-              <w:jc w:val="left"/>
-              <w:rPr>
-                <w:rFonts w:ascii="arial" w:hAnsi="arial" w:eastAsia="Calibri"/>
-                <w:b/>
-                <w:b/>
-                <w:bCs/>
-                <w:kern w:val="0"/>
-                <w:lang w:val="en-US" w:eastAsia="en-US" w:bidi="ar-SA"/>
-              </w:rPr>
-            </w:pPr>
-            <w:r>
-              <w:rPr>
-                <w:rFonts w:eastAsia="Calibri" w:cs="Aptos" w:ascii="arial" w:hAnsi="arial" w:cstheme="minorHAnsi"/>
-                <w:b/>
-                <w:bCs/>
-                <w:kern w:val="0"/>
-                <w:sz w:val="20"/>
-                <w:szCs w:val="20"/>
-                <w:lang w:val="en-US" w:eastAsia="en-US" w:bidi="ar-SA"/>
-              </w:rPr>
-              <w:t>AWS (</w:t>
-            </w:r>
-            <w:r>
-              <w:rPr>
-                <w:rFonts w:eastAsia="Calibri" w:cs="Aptos" w:ascii="arial" w:hAnsi="arial" w:cstheme="minorHAnsi"/>
-                <w:b/>
-                <w:bCs/>
-                <w:spacing w:val="4"/>
-                <w:kern w:val="0"/>
-                <w:sz w:val="20"/>
-                <w:szCs w:val="20"/>
-                <w:lang w:val="en-US" w:eastAsia="en-US" w:bidi="ar-SA"/>
-              </w:rPr>
-              <w:t>Cloud formation template, Lambda server less function, S3, dynamo DB, API gateway, SQS, Elastic search, IAM and other services)</w:t>
-            </w:r>
-          </w:p>
-          <w:p>
-            <w:pPr>
-              <w:pStyle w:val="Normal"/>
-              <w:widowControl w:val="false"/>
-              <w:spacing w:lineRule="auto" w:line="240" w:before="0" w:after="0"/>
-              <w:jc w:val="left"/>
-              <w:rPr>
-                <w:rFonts w:ascii="arial" w:hAnsi="arial" w:eastAsia="Calibri"/>
-                <w:bCs/>
-                <w:kern w:val="0"/>
-                <w:lang w:val="en-US" w:eastAsia="en-US" w:bidi="ar-SA"/>
-              </w:rPr>
-            </w:pPr>
             <w:r>
               <w:rPr>
                 <w:rFonts w:eastAsia="Calibri" w:cs="Aptos" w:ascii="arial" w:hAnsi="arial" w:cstheme="minorHAnsi"/>
@@ -1453,7 +959,7 @@
                 <w:szCs w:val="20"/>
                 <w:lang w:val="en-US" w:eastAsia="en-US" w:bidi="ar-SA"/>
               </w:rPr>
-              <w:t>Azure (Functions, Logic Apps, Event Hub, Service Bus), Oracle HCM Cloud.</w:t>
+              <w:t>s, Github Actions</w:t>
             </w:r>
           </w:p>
         </w:tc>
@@ -1500,6 +1006,1989 @@
     <w:p>
       <w:pPr>
         <w:pStyle w:val="Normal"/>
+        <w:spacing w:before="0" w:after="32"/>
+        <w:jc w:val="both"/>
+        <w:rPr>
+          <w:rFonts w:eastAsia="Arial" w:cs="Arial"/>
+          <w:color w:val="404040"/>
+          <w:sz w:val="20"/>
+        </w:rPr>
+      </w:pPr>
+      <w:r>
+        <w:rPr>
+          <w:rFonts w:eastAsia="Arial" w:cs="Arial"/>
+          <w:color w:val="404040"/>
+          <w:sz w:val="20"/>
+        </w:rPr>
+      </w:r>
+    </w:p>
+    <w:p>
+      <w:pPr>
+        <w:pStyle w:val="Normal"/>
+        <w:spacing w:before="0" w:after="32"/>
+        <w:jc w:val="both"/>
+        <w:rPr>
+          <w:rFonts w:eastAsia="Arial" w:cs="Arial"/>
+          <w:color w:val="404040"/>
+          <w:sz w:val="20"/>
+        </w:rPr>
+      </w:pPr>
+      <w:r>
+        <w:rPr>
+          <w:rFonts w:eastAsia="Arial" w:cs="Arial"/>
+          <w:color w:val="404040"/>
+          <w:sz w:val="20"/>
+        </w:rPr>
+      </w:r>
+    </w:p>
+    <w:p>
+      <w:pPr>
+        <w:pStyle w:val="Normal"/>
+        <w:spacing w:before="0" w:after="32"/>
+        <w:jc w:val="both"/>
+        <w:rPr>
+          <w:rFonts w:eastAsia="Arial" w:cs="Arial"/>
+          <w:color w:val="404040"/>
+          <w:sz w:val="20"/>
+        </w:rPr>
+      </w:pPr>
+      <w:r>
+        <w:rPr>
+          <w:rFonts w:eastAsia="Arial" w:cs="Arial"/>
+          <w:color w:val="404040"/>
+          <w:sz w:val="20"/>
+        </w:rPr>
+      </w:r>
+    </w:p>
+    <w:p>
+      <w:pPr>
+        <w:pStyle w:val="Normal"/>
+        <w:spacing w:before="0" w:after="32"/>
+        <w:jc w:val="both"/>
+        <w:rPr>
+          <w:rFonts w:eastAsia="Arial" w:cs="Arial"/>
+          <w:color w:val="404040"/>
+          <w:sz w:val="20"/>
+        </w:rPr>
+      </w:pPr>
+      <w:r>
+        <w:rPr>
+          <w:rFonts w:eastAsia="Arial" w:cs="Arial"/>
+          <w:color w:val="404040"/>
+          <w:sz w:val="20"/>
+        </w:rPr>
+      </w:r>
+    </w:p>
+    <w:p>
+      <w:pPr>
+        <w:pStyle w:val="Heading1"/>
+        <w:spacing w:before="0" w:after="132"/>
+        <w:ind w:left="-5" w:hanging="10"/>
+        <w:rPr/>
+      </w:pPr>
+      <w:r>
+        <w:rPr/>
+        <w:t xml:space="preserve">EXPERIENCE </w:t>
+      </w:r>
+    </w:p>
+    <w:p>
+      <w:pPr>
+        <w:pStyle w:val="Normal"/>
+        <w:spacing w:before="0" w:after="3"/>
+        <w:ind w:left="-5" w:hanging="10"/>
+        <w:rPr/>
+      </w:pPr>
+      <w:r>
+        <w:rPr>
+          <w:rFonts w:eastAsia="Aptos" w:cs="Aptos" w:ascii="Aptos" w:hAnsi="Aptos"/>
+          <w:b/>
+          <w:sz w:val="24"/>
+        </w:rPr>
+        <w:t xml:space="preserve">Dec 2024-Current </w:t>
+      </w:r>
+    </w:p>
+    <w:p>
+      <w:pPr>
+        <w:pStyle w:val="Heading2"/>
+        <w:spacing w:before="0" w:after="85"/>
+        <w:ind w:left="-5" w:hanging="10"/>
+        <w:rPr/>
+      </w:pPr>
+      <w:r>
+        <w:rPr/>
+        <w:t xml:space="preserve">Senior Developer | Tata Consultancy Services | Cigna | Postage Feature </w:t>
+      </w:r>
+    </w:p>
+    <w:p>
+      <w:pPr>
+        <w:pStyle w:val="Normal"/>
+        <w:numPr>
+          <w:ilvl w:val="0"/>
+          <w:numId w:val="2"/>
+        </w:numPr>
+        <w:spacing w:lineRule="auto" w:line="252" w:before="0" w:after="3"/>
+        <w:ind w:left="706" w:hanging="360"/>
+        <w:rPr/>
+      </w:pPr>
+      <w:r>
+        <w:rPr>
+          <w:rFonts w:eastAsia="Aptos" w:cs="Aptos" w:ascii="Aptos" w:hAnsi="Aptos"/>
+          <w:sz w:val="24"/>
+        </w:rPr>
+        <w:t>Worked on Oracle Forms and Oracle PL/SQL to develop, enhance, and maintain data-driven enterprise applications.</w:t>
+      </w:r>
+    </w:p>
+    <w:p>
+      <w:pPr>
+        <w:pStyle w:val="Normal"/>
+        <w:numPr>
+          <w:ilvl w:val="0"/>
+          <w:numId w:val="2"/>
+        </w:numPr>
+        <w:spacing w:lineRule="auto" w:line="252" w:before="0" w:after="3"/>
+        <w:ind w:left="706" w:hanging="360"/>
+        <w:rPr>
+          <w:rFonts w:ascii="Aptos" w:hAnsi="Aptos" w:eastAsia="Aptos" w:cs="Aptos"/>
+          <w:sz w:val="24"/>
+        </w:rPr>
+      </w:pPr>
+      <w:r>
+        <w:rPr>
+          <w:rFonts w:eastAsia="Aptos" w:cs="Aptos" w:ascii="Aptos" w:hAnsi="Aptos"/>
+          <w:sz w:val="24"/>
+        </w:rPr>
+        <w:t>Utilized GitHub for version control, collaborative code management, and streamlined project workflow.</w:t>
+      </w:r>
+    </w:p>
+    <w:p>
+      <w:pPr>
+        <w:pStyle w:val="Normal"/>
+        <w:numPr>
+          <w:ilvl w:val="0"/>
+          <w:numId w:val="2"/>
+        </w:numPr>
+        <w:spacing w:lineRule="auto" w:line="252" w:before="0" w:after="3"/>
+        <w:ind w:left="706" w:hanging="360"/>
+        <w:rPr/>
+      </w:pPr>
+      <w:r>
+        <w:rPr>
+          <w:rFonts w:eastAsia="Aptos" w:cs="Aptos" w:ascii="Aptos" w:hAnsi="Aptos"/>
+          <w:sz w:val="24"/>
+        </w:rPr>
+        <w:t xml:space="preserve">Develop new programs / modify existing programs based on the requirements that were given by business analysts. </w:t>
+      </w:r>
+    </w:p>
+    <w:p>
+      <w:pPr>
+        <w:pStyle w:val="Normal"/>
+        <w:numPr>
+          <w:ilvl w:val="0"/>
+          <w:numId w:val="2"/>
+        </w:numPr>
+        <w:spacing w:lineRule="auto" w:line="252" w:before="0" w:after="3"/>
+        <w:ind w:left="706" w:hanging="360"/>
+        <w:rPr/>
+      </w:pPr>
+      <w:r>
+        <w:rPr>
+          <w:rFonts w:eastAsia="Aptos" w:cs="Aptos" w:ascii="Aptos" w:hAnsi="Aptos"/>
+          <w:sz w:val="24"/>
+        </w:rPr>
+        <w:t xml:space="preserve">Schedule a call for code walkthrough with business analysts and business to have a clear understanding of the requirements. </w:t>
+      </w:r>
+    </w:p>
+    <w:p>
+      <w:pPr>
+        <w:pStyle w:val="Normal"/>
+        <w:numPr>
+          <w:ilvl w:val="0"/>
+          <w:numId w:val="2"/>
+        </w:numPr>
+        <w:spacing w:lineRule="auto" w:line="252" w:before="0" w:after="3"/>
+        <w:ind w:left="706" w:hanging="360"/>
+        <w:rPr/>
+      </w:pPr>
+      <w:r>
+        <w:rPr>
+          <w:rFonts w:eastAsia="Aptos" w:cs="Aptos" w:ascii="Aptos" w:hAnsi="Aptos"/>
+          <w:sz w:val="24"/>
+        </w:rPr>
+        <w:t xml:space="preserve">Update daily status to business folks through email / Scrum call with respect to the project. </w:t>
+      </w:r>
+    </w:p>
+    <w:p>
+      <w:pPr>
+        <w:pStyle w:val="Normal"/>
+        <w:numPr>
+          <w:ilvl w:val="0"/>
+          <w:numId w:val="2"/>
+        </w:numPr>
+        <w:spacing w:lineRule="auto" w:line="252" w:before="0" w:after="3"/>
+        <w:ind w:left="706" w:hanging="360"/>
+        <w:rPr/>
+      </w:pPr>
+      <w:r>
+        <w:rPr>
+          <w:rFonts w:eastAsia="Aptos" w:cs="Aptos" w:ascii="Aptos" w:hAnsi="Aptos"/>
+          <w:sz w:val="24"/>
+        </w:rPr>
+        <w:t xml:space="preserve">Improving and streamlining the business process by scheduling walkthroughs with business analysts to understand the requirements. </w:t>
+      </w:r>
+    </w:p>
+    <w:p>
+      <w:pPr>
+        <w:pStyle w:val="Normal"/>
+        <w:numPr>
+          <w:ilvl w:val="0"/>
+          <w:numId w:val="2"/>
+        </w:numPr>
+        <w:spacing w:lineRule="auto" w:line="252" w:before="0" w:after="3"/>
+        <w:ind w:left="706" w:hanging="360"/>
+        <w:rPr/>
+      </w:pPr>
+      <w:r>
+        <w:rPr>
+          <w:rFonts w:eastAsia="Aptos" w:cs="Aptos" w:ascii="Aptos" w:hAnsi="Aptos"/>
+          <w:sz w:val="24"/>
+        </w:rPr>
+        <w:t xml:space="preserve">Work closely with technical architects to develop solutions. </w:t>
+      </w:r>
+    </w:p>
+    <w:p>
+      <w:pPr>
+        <w:pStyle w:val="Normal"/>
+        <w:numPr>
+          <w:ilvl w:val="0"/>
+          <w:numId w:val="2"/>
+        </w:numPr>
+        <w:spacing w:lineRule="auto" w:line="252" w:before="0" w:after="3"/>
+        <w:ind w:left="706" w:hanging="360"/>
+        <w:rPr/>
+      </w:pPr>
+      <w:r>
+        <w:rPr>
+          <w:rFonts w:eastAsia="Arial" w:cs="Arial" w:ascii="aptos" w:hAnsi="aptos"/>
+          <w:sz w:val="24"/>
+          <w:szCs w:val="24"/>
+        </w:rPr>
+        <w:t>Peer Review the code and provide feedback and comments.</w:t>
+      </w:r>
+      <w:r>
+        <w:rPr>
+          <w:rFonts w:eastAsia="Aptos" w:cs="Aptos" w:ascii="Aptos" w:hAnsi="Aptos"/>
+          <w:sz w:val="24"/>
+        </w:rPr>
+        <w:t xml:space="preserve"> </w:t>
+      </w:r>
+    </w:p>
+    <w:p>
+      <w:pPr>
+        <w:pStyle w:val="Normal"/>
+        <w:numPr>
+          <w:ilvl w:val="0"/>
+          <w:numId w:val="2"/>
+        </w:numPr>
+        <w:spacing w:lineRule="auto" w:line="252" w:before="0" w:after="3"/>
+        <w:ind w:left="706" w:hanging="360"/>
+        <w:rPr/>
+      </w:pPr>
+      <w:r>
+        <w:rPr>
+          <w:rFonts w:eastAsia="Aptos" w:cs="Aptos" w:ascii="Aptos" w:hAnsi="Aptos"/>
+          <w:sz w:val="24"/>
+        </w:rPr>
+        <w:t xml:space="preserve">Assisted clients and business partners with questions and problems- involving configurations. </w:t>
+      </w:r>
+    </w:p>
+    <w:p>
+      <w:pPr>
+        <w:pStyle w:val="Normal"/>
+        <w:numPr>
+          <w:ilvl w:val="0"/>
+          <w:numId w:val="2"/>
+        </w:numPr>
+        <w:spacing w:lineRule="auto" w:line="252" w:before="0" w:after="3"/>
+        <w:ind w:left="706" w:hanging="360"/>
+        <w:rPr/>
+      </w:pPr>
+      <w:r>
+        <w:rPr>
+          <w:rFonts w:eastAsia="Aptos" w:cs="Aptos" w:ascii="Aptos" w:hAnsi="Aptos"/>
+          <w:sz w:val="24"/>
+        </w:rPr>
+        <w:t xml:space="preserve">Managed and provided solution to multiple simultaneous customers asks/requests. </w:t>
+      </w:r>
+    </w:p>
+    <w:p>
+      <w:pPr>
+        <w:pStyle w:val="Normal"/>
+        <w:numPr>
+          <w:ilvl w:val="0"/>
+          <w:numId w:val="2"/>
+        </w:numPr>
+        <w:spacing w:lineRule="auto" w:line="252" w:before="0" w:after="3"/>
+        <w:ind w:left="706" w:hanging="360"/>
+        <w:rPr/>
+      </w:pPr>
+      <w:r>
+        <w:rPr>
+          <w:rFonts w:eastAsia="Aptos" w:cs="Aptos" w:ascii="Aptos" w:hAnsi="Aptos"/>
+          <w:sz w:val="24"/>
+        </w:rPr>
+        <w:t xml:space="preserve">Monitor the job during production run / various non-production environments and communicate to stakeholders on the status daily basis </w:t>
+      </w:r>
+    </w:p>
+    <w:p>
+      <w:pPr>
+        <w:pStyle w:val="Normal"/>
+        <w:spacing w:before="0" w:after="0"/>
+        <w:ind w:left="361" w:hanging="0"/>
+        <w:rPr/>
+      </w:pPr>
+      <w:r>
+        <w:rPr>
+          <w:rFonts w:eastAsia="Aptos" w:cs="Aptos" w:ascii="Aptos" w:hAnsi="Aptos"/>
+          <w:sz w:val="24"/>
+        </w:rPr>
+        <w:t xml:space="preserve"> </w:t>
+      </w:r>
+    </w:p>
+    <w:p>
+      <w:pPr>
+        <w:pStyle w:val="Normal"/>
+        <w:spacing w:before="0" w:after="3"/>
+        <w:ind w:left="-5" w:hanging="10"/>
+        <w:rPr/>
+      </w:pPr>
+      <w:r>
+        <w:rPr>
+          <w:rFonts w:eastAsia="Aptos" w:cs="Aptos" w:ascii="Aptos" w:hAnsi="Aptos"/>
+          <w:b/>
+          <w:sz w:val="24"/>
+        </w:rPr>
+        <w:t xml:space="preserve">Nov 2019 - Nov 2024 </w:t>
+      </w:r>
+    </w:p>
+    <w:p>
+      <w:pPr>
+        <w:pStyle w:val="Heading2"/>
+        <w:spacing w:before="0" w:after="92"/>
+        <w:ind w:left="-5" w:hanging="10"/>
+        <w:rPr/>
+      </w:pPr>
+      <w:r>
+        <w:rPr/>
+        <w:t xml:space="preserve">Information Security Manager – Dual Role | Tata Consultancy Services | Kaiser Permanente| Security Compliance and Audits | All TCS Kaiser Operating Locations | </w:t>
+      </w:r>
+    </w:p>
+    <w:p>
+      <w:pPr>
+        <w:pStyle w:val="Normal"/>
+        <w:numPr>
+          <w:ilvl w:val="0"/>
+          <w:numId w:val="3"/>
+        </w:numPr>
+        <w:spacing w:lineRule="auto" w:line="252" w:before="0" w:after="3"/>
+        <w:ind w:left="706" w:hanging="360"/>
+        <w:rPr/>
+      </w:pPr>
+      <w:r>
+        <w:rPr>
+          <w:rFonts w:eastAsia="Aptos" w:cs="Aptos" w:ascii="Aptos" w:hAnsi="Aptos"/>
+          <w:sz w:val="24"/>
+        </w:rPr>
+        <w:t xml:space="preserve">Representing TCS for the account in Customer Audits. </w:t>
+      </w:r>
+    </w:p>
+    <w:p>
+      <w:pPr>
+        <w:pStyle w:val="Normal"/>
+        <w:numPr>
+          <w:ilvl w:val="0"/>
+          <w:numId w:val="3"/>
+        </w:numPr>
+        <w:spacing w:lineRule="auto" w:line="252" w:before="0" w:after="3"/>
+        <w:ind w:left="706" w:hanging="360"/>
+        <w:rPr/>
+      </w:pPr>
+      <w:r>
+        <w:rPr>
+          <w:rFonts w:eastAsia="Aptos" w:cs="Aptos" w:ascii="Aptos" w:hAnsi="Aptos"/>
+          <w:sz w:val="24"/>
+        </w:rPr>
+        <w:t xml:space="preserve">Taking up Internal Audits conducted by TCS for account. </w:t>
+      </w:r>
+    </w:p>
+    <w:p>
+      <w:pPr>
+        <w:pStyle w:val="Normal"/>
+        <w:numPr>
+          <w:ilvl w:val="0"/>
+          <w:numId w:val="3"/>
+        </w:numPr>
+        <w:spacing w:lineRule="auto" w:line="252" w:before="0" w:after="3"/>
+        <w:ind w:left="706" w:hanging="360"/>
+        <w:rPr/>
+      </w:pPr>
+      <w:r>
+        <w:rPr>
+          <w:rFonts w:eastAsia="Aptos" w:cs="Aptos" w:ascii="Aptos" w:hAnsi="Aptos"/>
+          <w:sz w:val="24"/>
+        </w:rPr>
+        <w:t xml:space="preserve">Maintaining and ensuing that the account is compliant in all security key factors through thorough monitoring. </w:t>
+      </w:r>
+    </w:p>
+    <w:p>
+      <w:pPr>
+        <w:pStyle w:val="Normal"/>
+        <w:numPr>
+          <w:ilvl w:val="0"/>
+          <w:numId w:val="3"/>
+        </w:numPr>
+        <w:spacing w:lineRule="auto" w:line="252" w:before="0" w:after="3"/>
+        <w:ind w:left="706" w:hanging="360"/>
+        <w:rPr/>
+      </w:pPr>
+      <w:r>
+        <w:rPr>
+          <w:rFonts w:eastAsia="Aptos" w:cs="Aptos" w:ascii="Aptos" w:hAnsi="Aptos"/>
+          <w:sz w:val="24"/>
+        </w:rPr>
+        <w:t xml:space="preserve">Ensure proper knowledge in security management and customer policies are spread across all associates in the account by conducting Security session to all associates. </w:t>
+      </w:r>
+    </w:p>
+    <w:p>
+      <w:pPr>
+        <w:pStyle w:val="Normal"/>
+        <w:numPr>
+          <w:ilvl w:val="0"/>
+          <w:numId w:val="3"/>
+        </w:numPr>
+        <w:spacing w:lineRule="auto" w:line="252" w:before="0" w:after="3"/>
+        <w:ind w:left="706" w:hanging="360"/>
+        <w:rPr/>
+      </w:pPr>
+      <w:r>
+        <w:rPr>
+          <w:rFonts w:eastAsia="Aptos" w:cs="Aptos" w:ascii="Aptos" w:hAnsi="Aptos"/>
+          <w:sz w:val="24"/>
+        </w:rPr>
+        <w:t xml:space="preserve">Reporting and investigation of security incidents and triaging them through calls connecting with the client vendor management support team to ensure they are getting closed with proper mitigation plan. </w:t>
+      </w:r>
+    </w:p>
+    <w:p>
+      <w:pPr>
+        <w:pStyle w:val="Normal"/>
+        <w:numPr>
+          <w:ilvl w:val="0"/>
+          <w:numId w:val="3"/>
+        </w:numPr>
+        <w:spacing w:lineRule="auto" w:line="252" w:before="0" w:after="3"/>
+        <w:ind w:left="706" w:hanging="360"/>
+        <w:rPr/>
+      </w:pPr>
+      <w:r>
+        <w:rPr>
+          <w:rFonts w:eastAsia="Aptos" w:cs="Aptos" w:ascii="Aptos" w:hAnsi="Aptos"/>
+          <w:sz w:val="24"/>
+        </w:rPr>
+        <w:t xml:space="preserve">Audit tracking, closure of NCs and findings that was tracked as part of internal and external client audits. </w:t>
+      </w:r>
+    </w:p>
+    <w:p>
+      <w:pPr>
+        <w:pStyle w:val="Normal"/>
+        <w:numPr>
+          <w:ilvl w:val="0"/>
+          <w:numId w:val="3"/>
+        </w:numPr>
+        <w:spacing w:lineRule="auto" w:line="252" w:before="0" w:after="3"/>
+        <w:ind w:left="706" w:hanging="360"/>
+        <w:rPr/>
+      </w:pPr>
+      <w:r>
+        <w:rPr>
+          <w:rFonts w:eastAsia="Aptos" w:cs="Aptos" w:ascii="Aptos" w:hAnsi="Aptos"/>
+          <w:sz w:val="24"/>
+        </w:rPr>
+        <w:t xml:space="preserve">Documentation and tracking of reports for all the finding and closure of them promptly. </w:t>
+      </w:r>
+    </w:p>
+    <w:p>
+      <w:pPr>
+        <w:pStyle w:val="Normal"/>
+        <w:numPr>
+          <w:ilvl w:val="0"/>
+          <w:numId w:val="3"/>
+        </w:numPr>
+        <w:spacing w:lineRule="auto" w:line="252" w:before="0" w:after="212"/>
+        <w:ind w:left="706" w:hanging="360"/>
+        <w:rPr>
+          <w:rFonts w:ascii="aptos" w:hAnsi="aptos"/>
+          <w:sz w:val="24"/>
+          <w:szCs w:val="24"/>
+        </w:rPr>
+      </w:pPr>
+      <w:r>
+        <w:rPr>
+          <w:rFonts w:eastAsia="Arial" w:cs="Arial" w:ascii="aptos" w:hAnsi="aptos"/>
+          <w:sz w:val="24"/>
+          <w:szCs w:val="24"/>
+        </w:rPr>
+        <w:t>Collaboration with the different location security SPOCs and carrying out centralized activities from Chennai location for all crucial security compliance activities.</w:t>
+      </w:r>
+      <w:r>
+        <w:rPr>
+          <w:rFonts w:eastAsia="Arial" w:cs="Arial" w:ascii="aptos" w:hAnsi="aptos"/>
+          <w:color w:val="404040"/>
+          <w:sz w:val="24"/>
+          <w:szCs w:val="24"/>
+        </w:rPr>
+        <w:t xml:space="preserve"> </w:t>
+      </w:r>
+    </w:p>
+    <w:p>
+      <w:pPr>
+        <w:pStyle w:val="Normal"/>
+        <w:spacing w:before="0" w:after="32"/>
+        <w:rPr/>
+      </w:pPr>
+      <w:r>
+        <w:rPr>
+          <w:rFonts w:eastAsia="Arial" w:cs="Arial" w:ascii="Arial" w:hAnsi="Arial"/>
+          <w:color w:val="404040"/>
+          <w:sz w:val="20"/>
+        </w:rPr>
+        <w:t xml:space="preserve"> </w:t>
+      </w:r>
+      <w:r>
+        <w:rPr>
+          <w:rFonts w:eastAsia="Aptos" w:cs="Aptos" w:ascii="Aptos" w:hAnsi="Aptos"/>
+          <w:b/>
+          <w:sz w:val="24"/>
+        </w:rPr>
+        <w:t xml:space="preserve">Oct 2016 - Nov 2024 </w:t>
+      </w:r>
+    </w:p>
+    <w:p>
+      <w:pPr>
+        <w:pStyle w:val="Normal"/>
+        <w:spacing w:before="0" w:after="3"/>
+        <w:ind w:left="-5" w:hanging="10"/>
+        <w:rPr/>
+      </w:pPr>
+      <w:r>
+        <w:rPr>
+          <w:rFonts w:eastAsia="Aptos" w:cs="Aptos" w:ascii="Aptos" w:hAnsi="Aptos"/>
+          <w:b/>
+          <w:sz w:val="24"/>
+        </w:rPr>
+        <w:t xml:space="preserve">Team Lead | Tata Consultancy Services | Kaiser Permanente| Medicare Business Engine - </w:t>
+      </w:r>
+      <w:r>
+        <w:rPr>
+          <w:rFonts w:ascii="Aptos" w:hAnsi="Aptos"/>
+          <w:b/>
+          <w:bCs/>
+          <w:sz w:val="24"/>
+          <w:szCs w:val="24"/>
+        </w:rPr>
+        <w:t>Development | Chennai</w:t>
+      </w:r>
+      <w:r>
+        <w:rPr/>
+        <w:t xml:space="preserve"> </w:t>
+      </w:r>
+    </w:p>
+    <w:p>
+      <w:pPr>
+        <w:pStyle w:val="Normal"/>
+        <w:numPr>
+          <w:ilvl w:val="0"/>
+          <w:numId w:val="4"/>
+        </w:numPr>
+        <w:spacing w:lineRule="auto" w:line="252" w:before="0" w:after="3"/>
+        <w:ind w:left="706" w:hanging="360"/>
+        <w:rPr>
+          <w:rFonts w:ascii="aptos" w:hAnsi="aptos"/>
+          <w:sz w:val="24"/>
+          <w:szCs w:val="24"/>
+        </w:rPr>
+      </w:pPr>
+      <w:r>
+        <w:rPr>
+          <w:rFonts w:eastAsia="Aptos" w:cs="Aptos" w:ascii="aptos" w:hAnsi="aptos"/>
+          <w:sz w:val="24"/>
+          <w:szCs w:val="24"/>
+        </w:rPr>
+        <w:t xml:space="preserve">Analysis, Design and Implementation of Applications using Oracle RDBMS. </w:t>
+      </w:r>
+    </w:p>
+    <w:p>
+      <w:pPr>
+        <w:pStyle w:val="Normal"/>
+        <w:numPr>
+          <w:ilvl w:val="0"/>
+          <w:numId w:val="4"/>
+        </w:numPr>
+        <w:spacing w:lineRule="auto" w:line="252" w:before="0" w:after="3"/>
+        <w:ind w:left="706" w:hanging="360"/>
+        <w:rPr>
+          <w:rFonts w:ascii="aptos" w:hAnsi="aptos"/>
+          <w:sz w:val="24"/>
+          <w:szCs w:val="24"/>
+        </w:rPr>
+      </w:pPr>
+      <w:r>
+        <w:rPr>
+          <w:rFonts w:eastAsia="Aptos" w:cs="Aptos" w:ascii="aptos" w:hAnsi="aptos"/>
+          <w:sz w:val="24"/>
+          <w:szCs w:val="24"/>
+        </w:rPr>
+        <w:t xml:space="preserve">Implementation of decoupled and clean architecture for business applications. </w:t>
+      </w:r>
+    </w:p>
+    <w:p>
+      <w:pPr>
+        <w:pStyle w:val="Normal"/>
+        <w:numPr>
+          <w:ilvl w:val="0"/>
+          <w:numId w:val="4"/>
+        </w:numPr>
+        <w:spacing w:lineRule="auto" w:line="252" w:before="0" w:after="3"/>
+        <w:ind w:left="706" w:hanging="360"/>
+        <w:rPr>
+          <w:rFonts w:ascii="aptos" w:hAnsi="aptos"/>
+          <w:sz w:val="24"/>
+          <w:szCs w:val="24"/>
+        </w:rPr>
+      </w:pPr>
+      <w:r>
+        <w:rPr>
+          <w:rFonts w:eastAsia="Aptos" w:cs="Aptos" w:ascii="aptos" w:hAnsi="aptos"/>
+          <w:sz w:val="24"/>
+          <w:szCs w:val="24"/>
+        </w:rPr>
+        <w:t xml:space="preserve">Developed Complex Database Objects like Stored Procedure, Packages, Functions and Triggers using SQL and PL/SQL. </w:t>
+      </w:r>
+    </w:p>
+    <w:p>
+      <w:pPr>
+        <w:pStyle w:val="Normal"/>
+        <w:numPr>
+          <w:ilvl w:val="0"/>
+          <w:numId w:val="4"/>
+        </w:numPr>
+        <w:spacing w:lineRule="auto" w:line="252" w:before="0" w:after="3"/>
+        <w:ind w:left="706" w:hanging="360"/>
+        <w:rPr>
+          <w:rFonts w:ascii="aptos" w:hAnsi="aptos"/>
+          <w:sz w:val="24"/>
+          <w:szCs w:val="24"/>
+        </w:rPr>
+      </w:pPr>
+      <w:r>
+        <w:rPr>
+          <w:rFonts w:eastAsia="Aptos" w:cs="Aptos" w:ascii="aptos" w:hAnsi="aptos"/>
+          <w:sz w:val="24"/>
+          <w:szCs w:val="24"/>
+        </w:rPr>
+        <w:t>Ongoing performance tuning activities on PL/SQL Programs</w:t>
+      </w:r>
+      <w:r>
+        <w:rPr>
+          <w:rFonts w:eastAsia="Arial" w:cs="Arial" w:ascii="aptos" w:hAnsi="aptos"/>
+          <w:color w:val="404040"/>
+          <w:sz w:val="24"/>
+          <w:szCs w:val="24"/>
+        </w:rPr>
+        <w:t xml:space="preserve"> </w:t>
+      </w:r>
+    </w:p>
+    <w:p>
+      <w:pPr>
+        <w:pStyle w:val="Normal"/>
+        <w:numPr>
+          <w:ilvl w:val="0"/>
+          <w:numId w:val="4"/>
+        </w:numPr>
+        <w:spacing w:lineRule="auto" w:line="252" w:before="0" w:after="4"/>
+        <w:ind w:left="706" w:hanging="360"/>
+        <w:rPr>
+          <w:rFonts w:ascii="aptos" w:hAnsi="aptos"/>
+          <w:sz w:val="24"/>
+          <w:szCs w:val="24"/>
+        </w:rPr>
+      </w:pPr>
+      <w:r>
+        <w:rPr>
+          <w:rFonts w:eastAsia="Aptos" w:cs="Aptos" w:ascii="aptos" w:hAnsi="aptos"/>
+          <w:sz w:val="24"/>
+          <w:szCs w:val="24"/>
+        </w:rPr>
+        <w:t>C</w:t>
+      </w:r>
+      <w:r>
+        <w:rPr>
+          <w:rFonts w:eastAsia="Arial" w:cs="Arial" w:ascii="aptos" w:hAnsi="aptos"/>
+          <w:sz w:val="24"/>
+          <w:szCs w:val="24"/>
+        </w:rPr>
+        <w:t>oordinated with front end design team to provide them with necessary stored</w:t>
+      </w:r>
+      <w:r>
+        <w:rPr>
+          <w:rFonts w:eastAsia="Aptos" w:cs="Aptos" w:ascii="aptos" w:hAnsi="aptos"/>
+          <w:sz w:val="24"/>
+          <w:szCs w:val="24"/>
+        </w:rPr>
+        <w:t xml:space="preserve"> </w:t>
+      </w:r>
+      <w:r>
+        <w:rPr>
+          <w:rFonts w:eastAsia="Segoe UI Symbol" w:cs="Segoe UI Symbol" w:ascii="aptos" w:hAnsi="aptos"/>
+          <w:color w:val="404040"/>
+          <w:sz w:val="24"/>
+          <w:szCs w:val="24"/>
+        </w:rPr>
+        <w:t>•</w:t>
+      </w:r>
+      <w:r>
+        <w:rPr>
+          <w:rFonts w:eastAsia="Arial" w:cs="Arial" w:ascii="aptos" w:hAnsi="aptos"/>
+          <w:color w:val="404040"/>
+          <w:sz w:val="24"/>
+          <w:szCs w:val="24"/>
+          <w:vertAlign w:val="subscript"/>
+        </w:rPr>
+        <w:t xml:space="preserve"> </w:t>
+      </w:r>
+      <w:r>
+        <w:rPr>
+          <w:rFonts w:eastAsia="Aptos" w:cs="Aptos" w:ascii="aptos" w:hAnsi="aptos"/>
+          <w:sz w:val="24"/>
+          <w:szCs w:val="24"/>
+        </w:rPr>
+        <w:t>procedures, triggers and packages using SQL and PL/SQL.</w:t>
+      </w:r>
+      <w:r>
+        <w:rPr>
+          <w:rFonts w:eastAsia="Aptos" w:cs="Aptos" w:ascii="aptos" w:hAnsi="aptos"/>
+          <w:color w:val="404040"/>
+          <w:sz w:val="24"/>
+          <w:szCs w:val="24"/>
+        </w:rPr>
+        <w:t xml:space="preserve"> </w:t>
+      </w:r>
+    </w:p>
+    <w:p>
+      <w:pPr>
+        <w:pStyle w:val="Normal"/>
+        <w:numPr>
+          <w:ilvl w:val="0"/>
+          <w:numId w:val="4"/>
+        </w:numPr>
+        <w:spacing w:lineRule="auto" w:line="252" w:before="0" w:after="4"/>
+        <w:ind w:left="706" w:hanging="360"/>
+        <w:rPr>
+          <w:rFonts w:ascii="aptos" w:hAnsi="aptos"/>
+          <w:sz w:val="24"/>
+          <w:szCs w:val="24"/>
+        </w:rPr>
+      </w:pPr>
+      <w:r>
+        <w:rPr>
+          <w:rFonts w:eastAsia="Arial" w:cs="Arial" w:ascii="aptos" w:hAnsi="aptos"/>
+          <w:sz w:val="24"/>
+          <w:szCs w:val="24"/>
+        </w:rPr>
+        <w:t>Support system / UA testing / QA / other environments of the code that got released for testing.</w:t>
+      </w:r>
+      <w:r>
+        <w:rPr>
+          <w:rFonts w:eastAsia="Aptos" w:cs="Aptos" w:ascii="aptos" w:hAnsi="aptos"/>
+          <w:color w:val="404040"/>
+          <w:sz w:val="24"/>
+          <w:szCs w:val="24"/>
+        </w:rPr>
+        <w:t xml:space="preserve"> </w:t>
+      </w:r>
+    </w:p>
+    <w:p>
+      <w:pPr>
+        <w:pStyle w:val="Normal"/>
+        <w:numPr>
+          <w:ilvl w:val="0"/>
+          <w:numId w:val="4"/>
+        </w:numPr>
+        <w:spacing w:lineRule="auto" w:line="252" w:before="0" w:after="3"/>
+        <w:ind w:left="706" w:hanging="360"/>
+        <w:rPr>
+          <w:rFonts w:ascii="aptos" w:hAnsi="aptos"/>
+          <w:sz w:val="24"/>
+          <w:szCs w:val="24"/>
+        </w:rPr>
+      </w:pPr>
+      <w:r>
+        <w:rPr>
+          <w:rFonts w:eastAsia="Aptos" w:cs="Aptos" w:ascii="aptos" w:hAnsi="aptos"/>
+          <w:sz w:val="24"/>
+          <w:szCs w:val="24"/>
+        </w:rPr>
+        <w:t xml:space="preserve">Update Project status to business folks through email / call recursively. </w:t>
+      </w:r>
+    </w:p>
+    <w:p>
+      <w:pPr>
+        <w:pStyle w:val="Normal"/>
+        <w:numPr>
+          <w:ilvl w:val="0"/>
+          <w:numId w:val="4"/>
+        </w:numPr>
+        <w:spacing w:lineRule="auto" w:line="252" w:before="0" w:after="3"/>
+        <w:ind w:left="706" w:hanging="360"/>
+        <w:rPr>
+          <w:rFonts w:ascii="aptos" w:hAnsi="aptos"/>
+          <w:sz w:val="24"/>
+          <w:szCs w:val="24"/>
+        </w:rPr>
+      </w:pPr>
+      <w:r>
+        <w:rPr>
+          <w:rFonts w:eastAsia="Aptos" w:cs="Aptos" w:ascii="aptos" w:hAnsi="aptos"/>
+          <w:sz w:val="24"/>
+          <w:szCs w:val="24"/>
+        </w:rPr>
+        <w:t xml:space="preserve">Validate and peer review the code of developers with feedback </w:t>
+      </w:r>
+    </w:p>
+    <w:p>
+      <w:pPr>
+        <w:pStyle w:val="Normal"/>
+        <w:numPr>
+          <w:ilvl w:val="0"/>
+          <w:numId w:val="4"/>
+        </w:numPr>
+        <w:spacing w:lineRule="auto" w:line="252" w:before="0" w:after="3"/>
+        <w:ind w:left="706" w:hanging="360"/>
+        <w:rPr>
+          <w:rFonts w:ascii="aptos" w:hAnsi="aptos"/>
+          <w:sz w:val="24"/>
+          <w:szCs w:val="24"/>
+        </w:rPr>
+      </w:pPr>
+      <w:r>
+        <w:rPr>
+          <w:rFonts w:eastAsia="Aptos" w:cs="Aptos" w:ascii="aptos" w:hAnsi="aptos"/>
+          <w:sz w:val="24"/>
+          <w:szCs w:val="24"/>
+        </w:rPr>
+        <w:t>Coordinate and Manage Code walkthroughs with Business Team for every release.</w:t>
+      </w:r>
+      <w:r>
+        <w:rPr>
+          <w:rFonts w:eastAsia="Aptos" w:cs="Aptos" w:ascii="aptos" w:hAnsi="aptos"/>
+          <w:color w:val="404040"/>
+          <w:sz w:val="24"/>
+          <w:szCs w:val="24"/>
+        </w:rPr>
+        <w:t xml:space="preserve"> </w:t>
+      </w:r>
+    </w:p>
+    <w:p>
+      <w:pPr>
+        <w:pStyle w:val="Normal"/>
+        <w:spacing w:before="0" w:after="16"/>
+        <w:rPr/>
+      </w:pPr>
+      <w:r>
+        <w:rPr>
+          <w:rFonts w:eastAsia="Aptos" w:cs="Aptos" w:ascii="Aptos" w:hAnsi="Aptos"/>
+          <w:color w:val="404040"/>
+          <w:sz w:val="20"/>
+        </w:rPr>
+        <w:t xml:space="preserve"> </w:t>
+      </w:r>
+    </w:p>
+    <w:p>
+      <w:pPr>
+        <w:pStyle w:val="Normal"/>
+        <w:spacing w:before="0" w:after="3"/>
+        <w:ind w:left="-5" w:hanging="10"/>
+        <w:rPr/>
+      </w:pPr>
+      <w:r>
+        <w:rPr>
+          <w:rFonts w:eastAsia="Aptos" w:cs="Aptos" w:ascii="Aptos" w:hAnsi="Aptos"/>
+          <w:b/>
+          <w:sz w:val="24"/>
+        </w:rPr>
+        <w:t xml:space="preserve">Oct 2014 - Oct 2016 </w:t>
+      </w:r>
+    </w:p>
+    <w:p>
+      <w:pPr>
+        <w:pStyle w:val="Normal"/>
+        <w:spacing w:before="0" w:after="3"/>
+        <w:ind w:left="-5" w:hanging="10"/>
+        <w:rPr/>
+      </w:pPr>
+      <w:r>
+        <w:rPr>
+          <w:rFonts w:eastAsia="Aptos" w:cs="Aptos" w:ascii="Aptos" w:hAnsi="Aptos"/>
+          <w:b/>
+          <w:sz w:val="24"/>
+        </w:rPr>
+        <w:t xml:space="preserve">Developer | Tata Consultancy Services | Kaiser Permanente| Benefits Enhancement </w:t>
+      </w:r>
+      <w:r>
+        <w:rPr>
+          <w:rFonts w:ascii="Aptos" w:hAnsi="Aptos"/>
+          <w:b/>
+          <w:bCs/>
+          <w:sz w:val="24"/>
+          <w:szCs w:val="24"/>
+        </w:rPr>
+        <w:t xml:space="preserve">Tracking System - Development| Chennai </w:t>
+      </w:r>
+    </w:p>
+    <w:p>
+      <w:pPr>
+        <w:pStyle w:val="Normal"/>
+        <w:spacing w:before="0" w:after="0"/>
+        <w:rPr>
+          <w:rFonts w:ascii="aptos" w:hAnsi="aptos"/>
+          <w:sz w:val="24"/>
+          <w:szCs w:val="24"/>
+        </w:rPr>
+      </w:pPr>
+      <w:r>
+        <w:rPr>
+          <w:rFonts w:eastAsia="Aptos" w:cs="Aptos" w:ascii="Aptos" w:hAnsi="Aptos"/>
+          <w:sz w:val="24"/>
+        </w:rPr>
+        <w:t xml:space="preserve"> </w:t>
+      </w:r>
+    </w:p>
+    <w:p>
+      <w:pPr>
+        <w:pStyle w:val="Normal"/>
+        <w:numPr>
+          <w:ilvl w:val="0"/>
+          <w:numId w:val="5"/>
+        </w:numPr>
+        <w:spacing w:lineRule="auto" w:line="252" w:before="0" w:after="4"/>
+        <w:ind w:left="706" w:hanging="360"/>
+        <w:rPr>
+          <w:rFonts w:ascii="aptos" w:hAnsi="aptos"/>
+          <w:sz w:val="24"/>
+          <w:szCs w:val="24"/>
+        </w:rPr>
+      </w:pPr>
+      <w:r>
+        <w:rPr>
+          <w:rFonts w:eastAsia="Arial" w:cs="Arial" w:ascii="aptos" w:hAnsi="aptos"/>
+          <w:sz w:val="24"/>
+          <w:szCs w:val="24"/>
+        </w:rPr>
+        <w:t xml:space="preserve">Involved in all phases of the SDLC (Software Development Life Cycle) </w:t>
+      </w:r>
+    </w:p>
+    <w:p>
+      <w:pPr>
+        <w:pStyle w:val="Normal"/>
+        <w:numPr>
+          <w:ilvl w:val="0"/>
+          <w:numId w:val="5"/>
+        </w:numPr>
+        <w:spacing w:lineRule="auto" w:line="252" w:before="0" w:after="4"/>
+        <w:ind w:left="706" w:hanging="360"/>
+        <w:rPr>
+          <w:rFonts w:ascii="aptos" w:hAnsi="aptos"/>
+          <w:sz w:val="24"/>
+          <w:szCs w:val="24"/>
+        </w:rPr>
+      </w:pPr>
+      <w:r>
+        <w:rPr>
+          <w:rFonts w:eastAsia="Arial" w:cs="Arial" w:ascii="aptos" w:hAnsi="aptos"/>
+          <w:sz w:val="24"/>
+          <w:szCs w:val="24"/>
+        </w:rPr>
+        <w:t xml:space="preserve">Requirements gathering and translating it into design document. </w:t>
+      </w:r>
+    </w:p>
+    <w:p>
+      <w:pPr>
+        <w:pStyle w:val="Normal"/>
+        <w:numPr>
+          <w:ilvl w:val="0"/>
+          <w:numId w:val="5"/>
+        </w:numPr>
+        <w:spacing w:lineRule="auto" w:line="252" w:before="0" w:after="4"/>
+        <w:ind w:left="706" w:hanging="360"/>
+        <w:rPr>
+          <w:rFonts w:ascii="aptos" w:hAnsi="aptos"/>
+          <w:sz w:val="24"/>
+          <w:szCs w:val="24"/>
+        </w:rPr>
+      </w:pPr>
+      <w:r>
+        <w:rPr>
+          <w:rFonts w:eastAsia="Arial" w:cs="Arial" w:ascii="aptos" w:hAnsi="aptos"/>
+          <w:sz w:val="24"/>
+          <w:szCs w:val="24"/>
+        </w:rPr>
+        <w:t xml:space="preserve">Development, testing and implementation of code ensuring timely delivery against aggressive deadlines. </w:t>
+      </w:r>
+    </w:p>
+    <w:p>
+      <w:pPr>
+        <w:pStyle w:val="Normal"/>
+        <w:numPr>
+          <w:ilvl w:val="0"/>
+          <w:numId w:val="5"/>
+        </w:numPr>
+        <w:spacing w:lineRule="auto" w:line="252" w:before="0" w:after="4"/>
+        <w:ind w:left="706" w:hanging="360"/>
+        <w:rPr>
+          <w:rFonts w:ascii="aptos" w:hAnsi="aptos"/>
+          <w:sz w:val="24"/>
+          <w:szCs w:val="24"/>
+        </w:rPr>
+      </w:pPr>
+      <w:r>
+        <w:rPr>
+          <w:rFonts w:eastAsia="Arial" w:cs="Arial" w:ascii="aptos" w:hAnsi="aptos"/>
+          <w:sz w:val="24"/>
+          <w:szCs w:val="24"/>
+        </w:rPr>
+        <w:t xml:space="preserve">Developed Materialized view for data replication in distributed environments. </w:t>
+      </w:r>
+    </w:p>
+    <w:p>
+      <w:pPr>
+        <w:pStyle w:val="Normal"/>
+        <w:numPr>
+          <w:ilvl w:val="0"/>
+          <w:numId w:val="5"/>
+        </w:numPr>
+        <w:spacing w:lineRule="auto" w:line="252" w:before="0" w:after="4"/>
+        <w:ind w:left="706" w:hanging="360"/>
+        <w:rPr>
+          <w:rFonts w:ascii="aptos" w:hAnsi="aptos"/>
+          <w:sz w:val="24"/>
+          <w:szCs w:val="24"/>
+        </w:rPr>
+      </w:pPr>
+      <w:r>
+        <w:rPr>
+          <w:rFonts w:eastAsia="Arial" w:cs="Arial" w:ascii="aptos" w:hAnsi="aptos"/>
+          <w:sz w:val="24"/>
+          <w:szCs w:val="24"/>
+        </w:rPr>
+        <w:t xml:space="preserve">Effectively made use of Table Functions, Indexes, Collections, Materialized Views and Query Re-Write. </w:t>
+      </w:r>
+    </w:p>
+    <w:p>
+      <w:pPr>
+        <w:pStyle w:val="Normal"/>
+        <w:numPr>
+          <w:ilvl w:val="0"/>
+          <w:numId w:val="5"/>
+        </w:numPr>
+        <w:spacing w:lineRule="auto" w:line="252" w:before="0" w:after="4"/>
+        <w:ind w:left="706" w:hanging="360"/>
+        <w:rPr>
+          <w:rFonts w:ascii="aptos" w:hAnsi="aptos"/>
+          <w:sz w:val="24"/>
+          <w:szCs w:val="24"/>
+        </w:rPr>
+      </w:pPr>
+      <w:r>
+        <w:rPr>
+          <w:rFonts w:eastAsia="Arial" w:cs="Arial" w:ascii="aptos" w:hAnsi="aptos"/>
+          <w:sz w:val="24"/>
+          <w:szCs w:val="24"/>
+        </w:rPr>
+        <w:t xml:space="preserve">Developed Web forms that have been used extensively in ASP.NET for FE  </w:t>
+      </w:r>
+    </w:p>
+    <w:p>
+      <w:pPr>
+        <w:pStyle w:val="Normal"/>
+        <w:numPr>
+          <w:ilvl w:val="0"/>
+          <w:numId w:val="5"/>
+        </w:numPr>
+        <w:spacing w:lineRule="auto" w:line="252" w:before="0" w:after="4"/>
+        <w:ind w:left="706" w:hanging="360"/>
+        <w:rPr>
+          <w:rFonts w:ascii="aptos" w:hAnsi="aptos"/>
+          <w:sz w:val="24"/>
+          <w:szCs w:val="24"/>
+        </w:rPr>
+      </w:pPr>
+      <w:r>
+        <w:rPr>
+          <w:rFonts w:eastAsia="Arial" w:cs="Arial" w:ascii="aptos" w:hAnsi="aptos"/>
+          <w:sz w:val="24"/>
+          <w:szCs w:val="24"/>
+        </w:rPr>
+        <w:t xml:space="preserve">Expertise in creating visually appealing user interface with CSS </w:t>
+      </w:r>
+    </w:p>
+    <w:p>
+      <w:pPr>
+        <w:pStyle w:val="Normal"/>
+        <w:numPr>
+          <w:ilvl w:val="0"/>
+          <w:numId w:val="5"/>
+        </w:numPr>
+        <w:spacing w:lineRule="auto" w:line="252" w:before="0" w:after="4"/>
+        <w:ind w:left="706" w:hanging="360"/>
+        <w:rPr/>
+      </w:pPr>
+      <w:r>
+        <w:rPr>
+          <w:rFonts w:eastAsia="Arial" w:cs="Arial" w:ascii="aptos" w:hAnsi="aptos"/>
+          <w:sz w:val="24"/>
+          <w:szCs w:val="24"/>
+        </w:rPr>
+        <w:t>Coordinate knowledge transition to production support team on the changes that were deployed into production as part of Dev releases.</w:t>
+      </w:r>
+      <w:r>
+        <w:rPr>
+          <w:rFonts w:eastAsia="Arial" w:cs="Arial" w:ascii="Arial" w:hAnsi="Arial"/>
+          <w:sz w:val="24"/>
+        </w:rPr>
+        <w:t xml:space="preserve"> </w:t>
+      </w:r>
+    </w:p>
+    <w:p>
+      <w:pPr>
+        <w:pStyle w:val="Normal"/>
+        <w:spacing w:before="0" w:after="0"/>
+        <w:rPr/>
+      </w:pPr>
+      <w:r>
+        <w:rPr>
+          <w:rFonts w:eastAsia="Aptos" w:cs="Aptos" w:ascii="Aptos" w:hAnsi="Aptos"/>
+          <w:b/>
+          <w:sz w:val="24"/>
+        </w:rPr>
+        <w:t xml:space="preserve"> </w:t>
+      </w:r>
+    </w:p>
+    <w:p>
+      <w:pPr>
+        <w:pStyle w:val="Normal"/>
+        <w:spacing w:before="0" w:after="3"/>
+        <w:ind w:left="-5" w:hanging="10"/>
+        <w:rPr/>
+      </w:pPr>
+      <w:r>
+        <w:rPr>
+          <w:rFonts w:eastAsia="Aptos" w:cs="Aptos" w:ascii="Aptos" w:hAnsi="Aptos"/>
+          <w:b/>
+          <w:sz w:val="24"/>
+        </w:rPr>
+        <w:t xml:space="preserve">Sep 2012 - Sep 2014 </w:t>
+      </w:r>
+    </w:p>
+    <w:p>
+      <w:pPr>
+        <w:pStyle w:val="Heading2"/>
+        <w:ind w:left="-5" w:hanging="10"/>
+        <w:rPr/>
+      </w:pPr>
+      <w:r>
+        <w:rPr/>
+        <w:t>Developer| SHRIRAM VALUE SERVICES PVT LTD</w:t>
+      </w:r>
+      <w:r>
+        <w:rPr>
+          <w:color w:val="404040"/>
+        </w:rPr>
+        <w:t xml:space="preserve"> </w:t>
+      </w:r>
+      <w:r>
+        <w:rPr/>
+        <w:t xml:space="preserve">| Chennai </w:t>
+      </w:r>
+    </w:p>
+    <w:p>
+      <w:pPr>
+        <w:pStyle w:val="Normal"/>
+        <w:numPr>
+          <w:ilvl w:val="0"/>
+          <w:numId w:val="6"/>
+        </w:numPr>
+        <w:spacing w:lineRule="auto" w:line="252" w:before="0" w:after="3"/>
+        <w:ind w:left="1081" w:hanging="360"/>
+        <w:rPr/>
+      </w:pPr>
+      <w:r>
+        <w:rPr>
+          <w:rFonts w:eastAsia="Aptos" w:cs="Aptos" w:ascii="Aptos" w:hAnsi="Aptos"/>
+          <w:sz w:val="24"/>
+        </w:rPr>
+        <w:t>Requirements gathering and translating it into design document.</w:t>
+      </w:r>
+      <w:r>
+        <w:rPr>
+          <w:rFonts w:eastAsia="Aptos" w:cs="Aptos" w:ascii="Aptos" w:hAnsi="Aptos"/>
+          <w:color w:val="404040"/>
+          <w:sz w:val="20"/>
+        </w:rPr>
+        <w:t xml:space="preserve"> </w:t>
+      </w:r>
+    </w:p>
+    <w:p>
+      <w:pPr>
+        <w:pStyle w:val="Normal"/>
+        <w:numPr>
+          <w:ilvl w:val="0"/>
+          <w:numId w:val="6"/>
+        </w:numPr>
+        <w:spacing w:lineRule="auto" w:line="252" w:before="0" w:after="3"/>
+        <w:ind w:left="1081" w:hanging="360"/>
+        <w:rPr/>
+      </w:pPr>
+      <w:r>
+        <w:rPr>
+          <w:rFonts w:eastAsia="Aptos" w:cs="Aptos" w:ascii="Aptos" w:hAnsi="Aptos"/>
+          <w:sz w:val="24"/>
+        </w:rPr>
+        <w:t xml:space="preserve">Code design, unit testing and Implementation. </w:t>
+      </w:r>
+    </w:p>
+    <w:p>
+      <w:pPr>
+        <w:pStyle w:val="Normal"/>
+        <w:numPr>
+          <w:ilvl w:val="0"/>
+          <w:numId w:val="6"/>
+        </w:numPr>
+        <w:spacing w:lineRule="auto" w:line="252" w:before="0" w:after="3"/>
+        <w:ind w:left="1081" w:hanging="360"/>
+        <w:rPr/>
+      </w:pPr>
+      <w:r>
+        <w:rPr>
+          <w:rStyle w:val="StrongEmphasis"/>
+          <w:rFonts w:eastAsia="Aptos" w:cs="Aptos" w:ascii="Aptos" w:hAnsi="Aptos"/>
+          <w:b w:val="false"/>
+          <w:bCs w:val="false"/>
+          <w:sz w:val="24"/>
+        </w:rPr>
+        <w:t>Created and enhanced ASP.NET applications with MS-SQL backend architecture</w:t>
+      </w:r>
+      <w:r>
+        <w:rPr>
+          <w:rFonts w:eastAsia="Aptos" w:cs="Aptos" w:ascii="Aptos" w:hAnsi="Aptos"/>
+          <w:b w:val="false"/>
+          <w:bCs w:val="false"/>
+          <w:sz w:val="24"/>
+        </w:rPr>
+        <w:t>, ensuring reliable performance through query optimization, secure integrations, and systematic data handling.</w:t>
+      </w:r>
+    </w:p>
+    <w:p>
+      <w:pPr>
+        <w:pStyle w:val="Normal"/>
+        <w:numPr>
+          <w:ilvl w:val="0"/>
+          <w:numId w:val="6"/>
+        </w:numPr>
+        <w:spacing w:lineRule="auto" w:line="252" w:before="0" w:after="3"/>
+        <w:ind w:left="1081" w:hanging="360"/>
+        <w:rPr>
+          <w:rFonts w:ascii="Aptos" w:hAnsi="Aptos" w:eastAsia="Aptos" w:cs="Aptos"/>
+          <w:b w:val="false"/>
+          <w:b w:val="false"/>
+          <w:bCs w:val="false"/>
+          <w:sz w:val="24"/>
+        </w:rPr>
+      </w:pPr>
+      <w:r>
+        <w:rPr>
+          <w:rFonts w:eastAsia="Aptos" w:cs="Aptos" w:ascii="Aptos" w:hAnsi="Aptos"/>
+          <w:b w:val="false"/>
+          <w:bCs w:val="false"/>
+          <w:sz w:val="24"/>
+        </w:rPr>
+        <w:t xml:space="preserve">Additionally, </w:t>
+      </w:r>
+      <w:r>
+        <w:rPr>
+          <w:rFonts w:eastAsia="Aptos" w:cs="Aptos" w:ascii="Aptos" w:hAnsi="Aptos"/>
+          <w:b w:val="false"/>
+          <w:bCs w:val="false"/>
+          <w:sz w:val="24"/>
+        </w:rPr>
+        <w:t>Implemented a robust scheduler using .NET with an MS-SQL backend to automate tasks and ensure reliable, time-based process execution.</w:t>
+      </w:r>
+    </w:p>
+    <w:p>
+      <w:pPr>
+        <w:pStyle w:val="Normal"/>
+        <w:numPr>
+          <w:ilvl w:val="0"/>
+          <w:numId w:val="6"/>
+        </w:numPr>
+        <w:spacing w:lineRule="auto" w:line="252" w:before="0" w:after="3"/>
+        <w:ind w:left="1081" w:hanging="360"/>
+        <w:rPr/>
+      </w:pPr>
+      <w:r>
+        <w:rPr>
+          <w:rFonts w:eastAsia="Aptos" w:cs="Aptos" w:ascii="Aptos" w:hAnsi="Aptos"/>
+          <w:sz w:val="24"/>
+        </w:rPr>
+        <w:t xml:space="preserve">Supported system and UA testing of the programs/fixes that were released for testing. </w:t>
+      </w:r>
+    </w:p>
+    <w:p>
+      <w:pPr>
+        <w:pStyle w:val="Normal"/>
+        <w:numPr>
+          <w:ilvl w:val="0"/>
+          <w:numId w:val="6"/>
+        </w:numPr>
+        <w:spacing w:lineRule="auto" w:line="252" w:before="0" w:after="3"/>
+        <w:ind w:left="1081" w:hanging="360"/>
+        <w:rPr/>
+      </w:pPr>
+      <w:r>
+        <w:rPr>
+          <w:rFonts w:eastAsia="Aptos" w:cs="Aptos" w:ascii="Aptos" w:hAnsi="Aptos"/>
+          <w:sz w:val="24"/>
+        </w:rPr>
+        <w:t xml:space="preserve">User manual and End-user training are conducted. </w:t>
+      </w:r>
+    </w:p>
+    <w:p>
+      <w:pPr>
+        <w:pStyle w:val="Normal"/>
+        <w:spacing w:before="0" w:after="0"/>
+        <w:rPr>
+          <w:rFonts w:ascii="Aptos" w:hAnsi="Aptos" w:eastAsia="Aptos" w:cs="Aptos"/>
+          <w:sz w:val="24"/>
+        </w:rPr>
+      </w:pPr>
+      <w:r>
+        <w:rPr/>
+      </w:r>
+    </w:p>
+    <w:p>
+      <w:pPr>
+        <w:pStyle w:val="Normal"/>
+        <w:spacing w:before="0" w:after="3"/>
+        <w:ind w:left="-5" w:hanging="10"/>
+        <w:rPr/>
+      </w:pPr>
+      <w:r>
+        <w:rPr>
+          <w:rFonts w:eastAsia="Aptos" w:cs="Aptos" w:ascii="Aptos" w:hAnsi="Aptos"/>
+          <w:b/>
+          <w:sz w:val="24"/>
+        </w:rPr>
+        <w:t xml:space="preserve">Feb 2012 - May 2012 </w:t>
+      </w:r>
+    </w:p>
+    <w:p>
+      <w:pPr>
+        <w:pStyle w:val="Heading2"/>
+        <w:ind w:left="-5" w:hanging="10"/>
+        <w:rPr/>
+      </w:pPr>
+      <w:r>
+        <w:rPr/>
+        <w:t xml:space="preserve">Developer| SUKHVARSHA MANAGEMENT SERVICES PVT LTD | Chennai </w:t>
+      </w:r>
+    </w:p>
+    <w:p>
+      <w:pPr>
+        <w:pStyle w:val="Normal"/>
+        <w:numPr>
+          <w:ilvl w:val="0"/>
+          <w:numId w:val="7"/>
+        </w:numPr>
+        <w:spacing w:lineRule="auto" w:line="252" w:before="0" w:after="3"/>
+        <w:ind w:left="706" w:hanging="360"/>
+        <w:rPr/>
+      </w:pPr>
+      <w:r>
+        <w:rPr>
+          <w:rFonts w:eastAsia="Aptos" w:cs="Aptos" w:ascii="Aptos" w:hAnsi="Aptos"/>
+          <w:sz w:val="24"/>
+        </w:rPr>
+        <w:t>Requirements gathering and translating it into design document.</w:t>
+      </w:r>
+      <w:r>
+        <w:rPr>
+          <w:rFonts w:eastAsia="Aptos" w:cs="Aptos" w:ascii="Aptos" w:hAnsi="Aptos"/>
+          <w:color w:val="404040"/>
+          <w:sz w:val="20"/>
+        </w:rPr>
+        <w:t xml:space="preserve"> </w:t>
+      </w:r>
+    </w:p>
+    <w:p>
+      <w:pPr>
+        <w:pStyle w:val="Normal"/>
+        <w:numPr>
+          <w:ilvl w:val="0"/>
+          <w:numId w:val="7"/>
+        </w:numPr>
+        <w:spacing w:lineRule="auto" w:line="252" w:before="0" w:after="3"/>
+        <w:ind w:left="706" w:hanging="360"/>
+        <w:rPr/>
+      </w:pPr>
+      <w:r>
+        <w:rPr>
+          <w:rFonts w:eastAsia="Aptos" w:cs="Aptos" w:ascii="Aptos" w:hAnsi="Aptos"/>
+          <w:sz w:val="24"/>
+        </w:rPr>
+        <w:t>Code design, unit testing and Implementation.</w:t>
+      </w:r>
+      <w:r>
+        <w:rPr>
+          <w:rFonts w:eastAsia="Aptos" w:cs="Aptos" w:ascii="Aptos" w:hAnsi="Aptos"/>
+          <w:color w:val="404040"/>
+          <w:sz w:val="20"/>
+        </w:rPr>
+        <w:t xml:space="preserve"> </w:t>
+      </w:r>
+    </w:p>
+    <w:p>
+      <w:pPr>
+        <w:pStyle w:val="Normal"/>
+        <w:numPr>
+          <w:ilvl w:val="0"/>
+          <w:numId w:val="7"/>
+        </w:numPr>
+        <w:spacing w:lineRule="auto" w:line="252" w:before="0" w:after="3"/>
+        <w:ind w:left="706" w:hanging="360"/>
+        <w:rPr>
+          <w:rFonts w:ascii="Aptos" w:hAnsi="Aptos" w:eastAsia="Aptos" w:cs="Aptos"/>
+          <w:color w:val="404040"/>
+          <w:sz w:val="20"/>
+        </w:rPr>
+      </w:pPr>
+      <w:r>
+        <w:rPr>
+          <w:rStyle w:val="StrongEmphasis"/>
+          <w:rFonts w:eastAsia="Aptos" w:cs="Aptos" w:ascii="Aptos" w:hAnsi="Aptos"/>
+          <w:b w:val="false"/>
+          <w:bCs w:val="false"/>
+          <w:color w:val="404040"/>
+          <w:sz w:val="24"/>
+          <w:szCs w:val="24"/>
+        </w:rPr>
+        <w:t>Engineered ASP.NET web solutions integrated with well-structured MS-SQL databases</w:t>
+      </w:r>
+      <w:r>
+        <w:rPr>
+          <w:rFonts w:eastAsia="Aptos" w:cs="Aptos" w:ascii="Aptos" w:hAnsi="Aptos"/>
+          <w:b w:val="false"/>
+          <w:bCs w:val="false"/>
+          <w:color w:val="404040"/>
+          <w:sz w:val="24"/>
+          <w:szCs w:val="24"/>
+        </w:rPr>
+        <w:t>, using efficient stored procedures, triggers, and backend logic to enhance data flow and application speed.</w:t>
+      </w:r>
+    </w:p>
+    <w:p>
+      <w:pPr>
+        <w:pStyle w:val="Normal"/>
+        <w:numPr>
+          <w:ilvl w:val="0"/>
+          <w:numId w:val="7"/>
+        </w:numPr>
+        <w:spacing w:lineRule="auto" w:line="228" w:before="0" w:after="1"/>
+        <w:ind w:left="706" w:hanging="360"/>
+        <w:rPr/>
+      </w:pPr>
+      <w:r>
+        <w:rPr>
+          <w:rFonts w:eastAsia="Aptos" w:cs="Aptos" w:ascii="Aptos" w:hAnsi="Aptos"/>
+          <w:sz w:val="24"/>
+        </w:rPr>
+        <w:t>Deployment of support activities in Production. Developed and modified programs based on business requirements, ensuring alignment with client needs and delivering measurable improvements in project efficiency.</w:t>
+      </w:r>
+      <w:r>
+        <w:rPr>
+          <w:rFonts w:eastAsia="Aptos" w:cs="Aptos" w:ascii="Aptos" w:hAnsi="Aptos"/>
+          <w:color w:val="404040"/>
+          <w:sz w:val="20"/>
+        </w:rPr>
+        <w:t xml:space="preserve"> </w:t>
+      </w:r>
+    </w:p>
+    <w:p>
+      <w:pPr>
+        <w:pStyle w:val="Normal"/>
+        <w:numPr>
+          <w:ilvl w:val="0"/>
+          <w:numId w:val="7"/>
+        </w:numPr>
+        <w:spacing w:lineRule="auto" w:line="252" w:before="0" w:after="3"/>
+        <w:ind w:left="706" w:hanging="360"/>
+        <w:rPr/>
+      </w:pPr>
+      <w:r>
+        <w:rPr>
+          <w:rFonts w:eastAsia="Aptos" w:cs="Aptos" w:ascii="Aptos" w:hAnsi="Aptos"/>
+          <w:sz w:val="24"/>
+        </w:rPr>
+        <w:t>Supported system and UA testing of the programs/fixes that were released for testing.</w:t>
+      </w:r>
+      <w:r>
+        <w:rPr>
+          <w:rFonts w:eastAsia="Aptos" w:cs="Aptos" w:ascii="Aptos" w:hAnsi="Aptos"/>
+          <w:color w:val="404040"/>
+          <w:sz w:val="20"/>
+        </w:rPr>
+        <w:t xml:space="preserve"> </w:t>
+      </w:r>
+    </w:p>
+    <w:p>
+      <w:pPr>
+        <w:pStyle w:val="Normal"/>
+        <w:numPr>
+          <w:ilvl w:val="0"/>
+          <w:numId w:val="7"/>
+        </w:numPr>
+        <w:spacing w:lineRule="auto" w:line="252" w:before="0" w:after="3"/>
+        <w:ind w:left="706" w:hanging="360"/>
+        <w:rPr/>
+      </w:pPr>
+      <w:r>
+        <w:rPr>
+          <w:rFonts w:eastAsia="Aptos" w:cs="Aptos" w:ascii="Aptos" w:hAnsi="Aptos"/>
+          <w:sz w:val="24"/>
+        </w:rPr>
+        <w:t>User manual and End-user training are conducted.</w:t>
+      </w:r>
+      <w:r>
+        <w:rPr>
+          <w:rFonts w:eastAsia="Aptos" w:cs="Aptos" w:ascii="Aptos" w:hAnsi="Aptos"/>
+          <w:color w:val="404040"/>
+          <w:sz w:val="20"/>
+        </w:rPr>
+        <w:t xml:space="preserve"> </w:t>
+      </w:r>
+    </w:p>
+    <w:p>
+      <w:pPr>
+        <w:pStyle w:val="Normal"/>
+        <w:spacing w:before="0" w:after="0"/>
+        <w:rPr/>
+      </w:pPr>
+      <w:r>
+        <w:rPr>
+          <w:rFonts w:eastAsia="Aptos" w:cs="Aptos" w:ascii="Aptos" w:hAnsi="Aptos"/>
+          <w:sz w:val="24"/>
+        </w:rPr>
+        <w:t xml:space="preserve"> </w:t>
+      </w:r>
+    </w:p>
+    <w:p>
+      <w:pPr>
+        <w:pStyle w:val="Normal"/>
+        <w:spacing w:before="0" w:after="3"/>
+        <w:ind w:left="-5" w:hanging="10"/>
+        <w:rPr/>
+      </w:pPr>
+      <w:r>
+        <w:rPr>
+          <w:rFonts w:eastAsia="Aptos" w:cs="Aptos" w:ascii="Aptos" w:hAnsi="Aptos"/>
+          <w:b/>
+          <w:sz w:val="24"/>
+        </w:rPr>
+        <w:t>Feb 2011 - Feb 2012</w:t>
+      </w:r>
+      <w:r>
+        <w:rPr>
+          <w:rFonts w:eastAsia="Aptos" w:cs="Aptos" w:ascii="Aptos" w:hAnsi="Aptos"/>
+          <w:b/>
+          <w:color w:val="404040"/>
+          <w:sz w:val="24"/>
+        </w:rPr>
+        <w:t xml:space="preserve"> </w:t>
+      </w:r>
+    </w:p>
+    <w:p>
+      <w:pPr>
+        <w:pStyle w:val="Heading2"/>
+        <w:ind w:left="-5" w:hanging="10"/>
+        <w:rPr/>
+      </w:pPr>
+      <w:r>
+        <w:rPr/>
+        <w:t xml:space="preserve">Developer| ZENTA KNOWLEDGE SERVICES PVT LTD | Chennai </w:t>
+      </w:r>
+    </w:p>
+    <w:p>
+      <w:pPr>
+        <w:pStyle w:val="Normal"/>
+        <w:numPr>
+          <w:ilvl w:val="0"/>
+          <w:numId w:val="8"/>
+        </w:numPr>
+        <w:spacing w:lineRule="auto" w:line="252" w:before="0" w:after="3"/>
+        <w:ind w:left="706" w:hanging="360"/>
+        <w:rPr/>
+      </w:pPr>
+      <w:r>
+        <w:rPr>
+          <w:rFonts w:eastAsia="Aptos" w:cs="Aptos" w:ascii="Aptos" w:hAnsi="Aptos"/>
+          <w:sz w:val="24"/>
+        </w:rPr>
+        <w:t xml:space="preserve">Requirements gathering and translating it into design document. </w:t>
+      </w:r>
+    </w:p>
+    <w:p>
+      <w:pPr>
+        <w:pStyle w:val="Normal"/>
+        <w:numPr>
+          <w:ilvl w:val="0"/>
+          <w:numId w:val="8"/>
+        </w:numPr>
+        <w:spacing w:lineRule="auto" w:line="252" w:before="0" w:after="3"/>
+        <w:ind w:left="706" w:hanging="360"/>
+        <w:rPr/>
+      </w:pPr>
+      <w:r>
+        <w:rPr>
+          <w:rStyle w:val="StrongEmphasis"/>
+          <w:rFonts w:eastAsia="Aptos" w:cs="Aptos" w:ascii="Aptos" w:hAnsi="Aptos"/>
+          <w:b w:val="false"/>
+          <w:bCs w:val="false"/>
+          <w:sz w:val="24"/>
+        </w:rPr>
+        <w:t>Developed and maintained ASP.NET web applications with optimized MS-SQL database design</w:t>
+      </w:r>
+      <w:r>
+        <w:rPr>
+          <w:rFonts w:eastAsia="Aptos" w:cs="Aptos" w:ascii="Aptos" w:hAnsi="Aptos"/>
+          <w:b w:val="false"/>
+          <w:bCs w:val="false"/>
+          <w:sz w:val="24"/>
+        </w:rPr>
+        <w:t xml:space="preserve">, implementing robust backend </w:t>
+      </w:r>
+      <w:r>
+        <w:rPr>
+          <w:rFonts w:eastAsia="Aptos" w:cs="Aptos" w:ascii="Aptos" w:hAnsi="Aptos"/>
+          <w:sz w:val="24"/>
+        </w:rPr>
+        <w:t>logic and performance-tuned queries (stored procedures, triggers) to ensure efficient data processing and high application responsiveness.</w:t>
+      </w:r>
+    </w:p>
+    <w:p>
+      <w:pPr>
+        <w:pStyle w:val="Normal"/>
+        <w:numPr>
+          <w:ilvl w:val="0"/>
+          <w:numId w:val="8"/>
+        </w:numPr>
+        <w:spacing w:lineRule="auto" w:line="252" w:before="0" w:after="3"/>
+        <w:ind w:left="706" w:hanging="360"/>
+        <w:rPr/>
+      </w:pPr>
+      <w:r>
+        <w:rPr>
+          <w:rFonts w:eastAsia="Aptos" w:cs="Aptos" w:ascii="Aptos" w:hAnsi="Aptos"/>
+          <w:sz w:val="24"/>
+        </w:rPr>
+        <w:t xml:space="preserve">Code design, unit testing and Implementation. </w:t>
+      </w:r>
+    </w:p>
+    <w:p>
+      <w:pPr>
+        <w:pStyle w:val="Normal"/>
+        <w:numPr>
+          <w:ilvl w:val="0"/>
+          <w:numId w:val="8"/>
+        </w:numPr>
+        <w:spacing w:lineRule="auto" w:line="252" w:before="0" w:after="3"/>
+        <w:ind w:left="706" w:hanging="360"/>
+        <w:rPr/>
+      </w:pPr>
+      <w:r>
+        <w:rPr>
+          <w:rFonts w:eastAsia="Aptos" w:cs="Aptos" w:ascii="Aptos" w:hAnsi="Aptos"/>
+          <w:sz w:val="24"/>
+        </w:rPr>
+        <w:t xml:space="preserve">Supported System and UAT testing of the programs/fixes in Releases. </w:t>
+      </w:r>
+    </w:p>
+    <w:p>
+      <w:pPr>
+        <w:pStyle w:val="Normal"/>
+        <w:numPr>
+          <w:ilvl w:val="0"/>
+          <w:numId w:val="8"/>
+        </w:numPr>
+        <w:spacing w:lineRule="auto" w:line="252" w:before="0" w:after="3"/>
+        <w:ind w:left="706" w:hanging="360"/>
+        <w:rPr/>
+      </w:pPr>
+      <w:r>
+        <w:rPr>
+          <w:rFonts w:eastAsia="Aptos" w:cs="Aptos" w:ascii="Aptos" w:hAnsi="Aptos"/>
+          <w:sz w:val="24"/>
+        </w:rPr>
+        <w:t xml:space="preserve">User manual and End-user training are conducted. </w:t>
+      </w:r>
+    </w:p>
+    <w:p>
+      <w:pPr>
+        <w:pStyle w:val="Normal"/>
+        <w:spacing w:before="0" w:after="0"/>
+        <w:rPr/>
+      </w:pPr>
+      <w:r>
+        <w:rPr>
+          <w:rFonts w:eastAsia="Aptos" w:cs="Aptos" w:ascii="Aptos" w:hAnsi="Aptos"/>
+          <w:sz w:val="24"/>
+        </w:rPr>
+        <w:t xml:space="preserve"> </w:t>
+      </w:r>
+    </w:p>
+    <w:p>
+      <w:pPr>
+        <w:pStyle w:val="Heading2"/>
+        <w:ind w:left="-5" w:hanging="10"/>
+        <w:rPr/>
+      </w:pPr>
+      <w:r>
+        <w:rPr/>
+        <w:t>Dec 2009 - Feb 2011</w:t>
+      </w:r>
+      <w:r>
+        <w:rPr>
+          <w:color w:val="404040"/>
+        </w:rPr>
+        <w:t xml:space="preserve"> </w:t>
+      </w:r>
+    </w:p>
+    <w:p>
+      <w:pPr>
+        <w:pStyle w:val="Normal"/>
+        <w:widowControl/>
+        <w:suppressAutoHyphens w:val="true"/>
+        <w:bidi w:val="0"/>
+        <w:spacing w:lineRule="auto" w:line="252" w:before="0" w:after="3"/>
+        <w:ind w:left="360" w:right="-180" w:hanging="360"/>
+        <w:jc w:val="left"/>
+        <w:rPr/>
+      </w:pPr>
+      <w:r>
+        <w:rPr>
+          <w:rFonts w:eastAsia="Aptos" w:cs="Aptos" w:ascii="Aptos" w:hAnsi="Aptos"/>
+          <w:b/>
+          <w:sz w:val="24"/>
+        </w:rPr>
+        <w:t xml:space="preserve">Developer| FUTURE TEC TECHNOLOGIES PVT LTD </w:t>
+      </w:r>
+      <w:r>
+        <w:rPr>
+          <w:rFonts w:eastAsia="Aptos" w:cs="Aptos" w:ascii="Aptos" w:hAnsi="Aptos"/>
+          <w:b/>
+          <w:sz w:val="24"/>
+        </w:rPr>
+        <w:t xml:space="preserve">| </w:t>
+      </w:r>
+      <w:r>
+        <w:rPr>
+          <w:rFonts w:eastAsia="Aptos" w:cs="Aptos" w:ascii="Aptos" w:hAnsi="Aptos"/>
+          <w:b/>
+          <w:sz w:val="24"/>
+        </w:rPr>
+        <w:t xml:space="preserve">Chennai </w:t>
+      </w:r>
+    </w:p>
+    <w:p>
+      <w:pPr>
+        <w:pStyle w:val="Normal"/>
+        <w:widowControl/>
+        <w:tabs>
+          <w:tab w:val="clear" w:pos="720"/>
+          <w:tab w:val="left" w:pos="724" w:leader="none"/>
+        </w:tabs>
+        <w:suppressAutoHyphens w:val="true"/>
+        <w:bidi w:val="0"/>
+        <w:spacing w:lineRule="auto" w:line="252" w:before="0" w:after="3"/>
+        <w:ind w:left="360" w:right="989" w:hanging="0"/>
+        <w:jc w:val="left"/>
+        <w:rPr/>
+      </w:pPr>
+      <w:r>
+        <w:rPr>
+          <w:rFonts w:eastAsia="Segoe UI Symbol" w:cs="Segoe UI Symbol" w:ascii="Segoe UI Symbol" w:hAnsi="Segoe UI Symbol"/>
+          <w:sz w:val="24"/>
+        </w:rPr>
+        <w:t>•</w:t>
+      </w:r>
+      <w:r>
+        <w:rPr>
+          <w:rFonts w:eastAsia="Arial" w:cs="Arial" w:ascii="Arial" w:hAnsi="Arial"/>
+          <w:sz w:val="24"/>
+        </w:rPr>
+        <w:t xml:space="preserve">   </w:t>
+      </w:r>
+      <w:r>
+        <w:rPr>
+          <w:rFonts w:eastAsia="Aptos" w:cs="Aptos" w:ascii="Aptos" w:hAnsi="Aptos"/>
+          <w:sz w:val="24"/>
+        </w:rPr>
+        <w:t xml:space="preserve">Requirements gathering and translating it into design document. </w:t>
+      </w:r>
+    </w:p>
+    <w:p>
+      <w:pPr>
+        <w:pStyle w:val="Normal"/>
+        <w:numPr>
+          <w:ilvl w:val="0"/>
+          <w:numId w:val="9"/>
+        </w:numPr>
+        <w:spacing w:lineRule="auto" w:line="252" w:before="0" w:after="3"/>
+        <w:ind w:left="706" w:hanging="360"/>
+        <w:rPr/>
+      </w:pPr>
+      <w:r>
+        <w:rPr>
+          <w:rFonts w:eastAsia="Aptos" w:cs="Aptos" w:ascii="Aptos" w:hAnsi="Aptos"/>
+          <w:sz w:val="24"/>
+        </w:rPr>
+        <w:t>Used HTML and JavaScript to build interactive, user-friendly interfaces and enhance overall application functionality.</w:t>
+      </w:r>
+    </w:p>
+    <w:p>
+      <w:pPr>
+        <w:pStyle w:val="Normal"/>
+        <w:numPr>
+          <w:ilvl w:val="0"/>
+          <w:numId w:val="9"/>
+        </w:numPr>
+        <w:spacing w:lineRule="auto" w:line="252" w:before="0" w:after="3"/>
+        <w:ind w:left="706" w:hanging="360"/>
+        <w:rPr>
+          <w:rFonts w:ascii="Aptos" w:hAnsi="Aptos" w:eastAsia="Aptos" w:cs="Aptos"/>
+          <w:sz w:val="24"/>
+        </w:rPr>
+      </w:pPr>
+      <w:r>
+        <w:rPr>
+          <w:rFonts w:eastAsia="Aptos" w:cs="Aptos" w:ascii="Aptos" w:hAnsi="Aptos"/>
+          <w:sz w:val="24"/>
+        </w:rPr>
+        <w:t xml:space="preserve">Also, </w:t>
+      </w:r>
+      <w:r>
+        <w:rPr>
+          <w:rFonts w:eastAsia="Aptos" w:cs="Aptos" w:ascii="Aptos" w:hAnsi="Aptos"/>
+          <w:sz w:val="24"/>
+        </w:rPr>
+        <w:t>Worked with SQL Server to design, manage, and optimize databases for efficient application performance.</w:t>
+      </w:r>
+    </w:p>
+    <w:p>
+      <w:pPr>
+        <w:pStyle w:val="Normal"/>
+        <w:numPr>
+          <w:ilvl w:val="0"/>
+          <w:numId w:val="9"/>
+        </w:numPr>
+        <w:spacing w:lineRule="auto" w:line="252" w:before="0" w:after="3"/>
+        <w:ind w:left="706" w:hanging="360"/>
+        <w:rPr/>
+      </w:pPr>
+      <w:r>
+        <w:rPr>
+          <w:rFonts w:eastAsia="Aptos" w:cs="Aptos" w:ascii="Aptos" w:hAnsi="Aptos"/>
+          <w:sz w:val="24"/>
+        </w:rPr>
+        <w:t xml:space="preserve">Code design, unit testing and Implementation. </w:t>
+      </w:r>
+    </w:p>
+    <w:p>
+      <w:pPr>
+        <w:pStyle w:val="Normal"/>
+        <w:numPr>
+          <w:ilvl w:val="0"/>
+          <w:numId w:val="9"/>
+        </w:numPr>
+        <w:spacing w:lineRule="auto" w:line="252" w:before="0" w:after="3"/>
+        <w:ind w:left="706" w:hanging="360"/>
+        <w:rPr/>
+      </w:pPr>
+      <w:r>
+        <w:rPr>
+          <w:rFonts w:eastAsia="Aptos" w:cs="Aptos" w:ascii="Aptos" w:hAnsi="Aptos"/>
+          <w:sz w:val="24"/>
+        </w:rPr>
+        <w:t xml:space="preserve">Supported system and UA testing of the programs/fixes that were released for testing. </w:t>
+      </w:r>
+    </w:p>
+    <w:p>
+      <w:pPr>
+        <w:pStyle w:val="Normal"/>
+        <w:numPr>
+          <w:ilvl w:val="0"/>
+          <w:numId w:val="9"/>
+        </w:numPr>
+        <w:spacing w:lineRule="auto" w:line="252" w:before="0" w:after="3"/>
+        <w:ind w:left="706" w:hanging="360"/>
+        <w:jc w:val="both"/>
+        <w:rPr>
+          <w:rFonts w:eastAsia="Arial" w:cs="Arial"/>
+          <w:color w:val="404040"/>
+          <w:sz w:val="20"/>
+        </w:rPr>
+      </w:pPr>
+      <w:r>
+        <w:rPr>
+          <w:rFonts w:eastAsia="Aptos" w:cs="Aptos" w:ascii="Aptos" w:hAnsi="Aptos"/>
+          <w:color w:val="404040"/>
+          <w:sz w:val="24"/>
+        </w:rPr>
+        <w:t xml:space="preserve">User manual and End-user training are conducted. </w:t>
+      </w:r>
+    </w:p>
+    <w:p>
+      <w:pPr>
+        <w:pStyle w:val="Normal"/>
+        <w:numPr>
+          <w:ilvl w:val="0"/>
+          <w:numId w:val="0"/>
+        </w:numPr>
+        <w:spacing w:lineRule="auto" w:line="252" w:before="0" w:after="3"/>
+        <w:ind w:left="706" w:hanging="0"/>
+        <w:jc w:val="both"/>
+        <w:rPr>
+          <w:rFonts w:eastAsia="Arial" w:cs="Arial"/>
+          <w:color w:val="404040"/>
+          <w:sz w:val="20"/>
+        </w:rPr>
+      </w:pPr>
+      <w:r>
+        <w:rPr>
+          <w:rFonts w:eastAsia="Arial" w:cs="Arial"/>
+          <w:color w:val="404040"/>
+          <w:sz w:val="20"/>
+        </w:rPr>
+      </w:r>
+    </w:p>
+    <w:p>
+      <w:pPr>
+        <w:pStyle w:val="Normal"/>
         <w:pBdr>
           <w:bottom w:val="single" w:sz="4" w:space="1" w:color="000000"/>
         </w:pBdr>
@@ -1526,7 +3015,7 @@
     <w:tbl>
       <w:tblPr>
         <w:tblStyle w:val="PlainTable2"/>
-        <w:tblW w:w="9360" w:type="dxa"/>
+        <w:tblW w:w="9635" w:type="dxa"/>
         <w:jc w:val="left"/>
         <w:tblInd w:w="0" w:type="dxa"/>
         <w:tblLayout w:type="fixed"/>
@@ -1539,8 +3028,8 @@
         <w:tblLook w:val="01e0" w:noHBand="0" w:noVBand="0" w:firstColumn="1" w:lastRow="1" w:lastColumn="1" w:firstRow="1"/>
       </w:tblPr>
       <w:tblGrid>
-        <w:gridCol w:w="3059"/>
-        <w:gridCol w:w="6301"/>
+        <w:gridCol w:w="3058"/>
+        <w:gridCol w:w="6577"/>
       </w:tblGrid>
       <w:tr>
         <w:trPr>
@@ -1549,7 +3038,7 @@
         </w:trPr>
         <w:tc>
           <w:tcPr>
-            <w:tcW w:w="3059" w:type="dxa"/>
+            <w:tcW w:w="3058" w:type="dxa"/>
             <w:cnfStyle w:val="001000000000" w:firstRow="0" w:lastRow="0" w:firstColumn="1" w:lastColumn="0" w:oddVBand="0" w:evenVBand="0" w:oddHBand="0" w:evenHBand="0" w:firstRowFirstColumn="0" w:firstRowLastColumn="0" w:lastRowFirstColumn="0" w:lastRowLastColumn="0"/>
             <w:tcBorders/>
             <w:vAlign w:val="center"/>
@@ -1609,7 +3098,7 @@
         </w:tc>
         <w:tc>
           <w:tcPr>
-            <w:tcW w:w="6301" w:type="dxa"/>
+            <w:tcW w:w="6577" w:type="dxa"/>
             <w:cnfStyle w:val="000100000000" w:firstRow="0" w:lastRow="0" w:firstColumn="0" w:lastColumn="1" w:oddVBand="0" w:evenVBand="0" w:oddHBand="0" w:evenHBand="0" w:firstRowFirstColumn="0" w:firstRowLastColumn="0" w:lastRowFirstColumn="0" w:lastRowLastColumn="0"/>
             <w:tcBorders/>
             <w:vAlign w:val="center"/>
@@ -1651,7 +3140,7 @@
         </w:trPr>
         <w:tc>
           <w:tcPr>
-            <w:tcW w:w="3059" w:type="dxa"/>
+            <w:tcW w:w="3058" w:type="dxa"/>
             <w:cnfStyle w:val="001000000000" w:firstRow="0" w:lastRow="0" w:firstColumn="1" w:lastColumn="0" w:oddVBand="0" w:evenVBand="0" w:oddHBand="0" w:evenHBand="0" w:firstRowFirstColumn="0" w:firstRowLastColumn="0" w:lastRowFirstColumn="0" w:lastRowLastColumn="0"/>
             <w:tcBorders/>
             <w:vAlign w:val="center"/>
@@ -1701,7 +3190,7 @@
         </w:tc>
         <w:tc>
           <w:tcPr>
-            <w:tcW w:w="6301" w:type="dxa"/>
+            <w:tcW w:w="6577" w:type="dxa"/>
             <w:cnfStyle w:val="000100000000" w:firstRow="0" w:lastRow="0" w:firstColumn="0" w:lastColumn="1" w:oddVBand="0" w:evenVBand="0" w:oddHBand="0" w:evenHBand="0" w:firstRowFirstColumn="0" w:firstRowLastColumn="0" w:lastRowFirstColumn="0" w:lastRowLastColumn="0"/>
             <w:tcBorders/>
             <w:vAlign w:val="center"/>
@@ -1753,7 +3242,7 @@
         </w:trPr>
         <w:tc>
           <w:tcPr>
-            <w:tcW w:w="3059" w:type="dxa"/>
+            <w:tcW w:w="3058" w:type="dxa"/>
             <w:cnfStyle w:val="001000000000" w:firstRow="0" w:lastRow="0" w:firstColumn="1" w:lastColumn="0" w:oddVBand="0" w:evenVBand="0" w:oddHBand="0" w:evenHBand="0" w:firstRowFirstColumn="0" w:firstRowLastColumn="0" w:lastRowFirstColumn="0" w:lastRowLastColumn="0"/>
             <w:tcBorders/>
             <w:vAlign w:val="center"/>
@@ -1803,7 +3292,7 @@
         </w:tc>
         <w:tc>
           <w:tcPr>
-            <w:tcW w:w="6301" w:type="dxa"/>
+            <w:tcW w:w="6577" w:type="dxa"/>
             <w:cnfStyle w:val="000100000000" w:firstRow="0" w:lastRow="0" w:firstColumn="0" w:lastColumn="1" w:oddVBand="0" w:evenVBand="0" w:oddHBand="0" w:evenHBand="0" w:firstRowFirstColumn="0" w:firstRowLastColumn="0" w:lastRowFirstColumn="0" w:lastRowLastColumn="0"/>
             <w:tcBorders/>
             <w:vAlign w:val="center"/>
@@ -1838,7 +3327,7 @@
         </w:trPr>
         <w:tc>
           <w:tcPr>
-            <w:tcW w:w="3059" w:type="dxa"/>
+            <w:tcW w:w="3058" w:type="dxa"/>
             <w:cnfStyle w:val="001000000000" w:firstRow="0" w:lastRow="0" w:firstColumn="1" w:lastColumn="0" w:oddVBand="0" w:evenVBand="0" w:oddHBand="0" w:evenHBand="0" w:firstRowFirstColumn="0" w:firstRowLastColumn="0" w:lastRowFirstColumn="0" w:lastRowLastColumn="0"/>
             <w:tcBorders/>
             <w:vAlign w:val="center"/>
@@ -1888,7 +3377,7 @@
         </w:tc>
         <w:tc>
           <w:tcPr>
-            <w:tcW w:w="6301" w:type="dxa"/>
+            <w:tcW w:w="6577" w:type="dxa"/>
             <w:cnfStyle w:val="000100000000" w:firstRow="0" w:lastRow="0" w:firstColumn="0" w:lastColumn="1" w:oddVBand="0" w:evenVBand="0" w:oddHBand="0" w:evenHBand="0" w:firstRowFirstColumn="0" w:firstRowLastColumn="0" w:lastRowFirstColumn="0" w:lastRowLastColumn="0"/>
             <w:tcBorders/>
             <w:vAlign w:val="center"/>
@@ -1923,7 +3412,7 @@
         </w:trPr>
         <w:tc>
           <w:tcPr>
-            <w:tcW w:w="3059" w:type="dxa"/>
+            <w:tcW w:w="3058" w:type="dxa"/>
             <w:cnfStyle w:val="001000000000" w:firstRow="0" w:lastRow="0" w:firstColumn="1" w:lastColumn="0" w:oddVBand="0" w:evenVBand="0" w:oddHBand="0" w:evenHBand="0" w:firstRowFirstColumn="0" w:firstRowLastColumn="0" w:lastRowFirstColumn="0" w:lastRowLastColumn="0"/>
             <w:tcBorders/>
             <w:vAlign w:val="center"/>
@@ -1973,7 +3462,7 @@
         </w:tc>
         <w:tc>
           <w:tcPr>
-            <w:tcW w:w="6301" w:type="dxa"/>
+            <w:tcW w:w="6577" w:type="dxa"/>
             <w:cnfStyle w:val="000100000000" w:firstRow="0" w:lastRow="0" w:firstColumn="0" w:lastColumn="1" w:oddVBand="0" w:evenVBand="0" w:oddHBand="0" w:evenHBand="0" w:firstRowFirstColumn="0" w:firstRowLastColumn="0" w:lastRowFirstColumn="0" w:lastRowLastColumn="0"/>
             <w:tcBorders/>
             <w:vAlign w:val="center"/>
@@ -2037,6 +3526,20 @@
     <w:p>
       <w:pPr>
         <w:pStyle w:val="Normal"/>
+        <w:spacing w:before="0" w:after="72"/>
+        <w:rPr>
+          <w:rFonts w:ascii="Arial" w:hAnsi="Arial" w:eastAsia="Arial" w:cs="Arial"/>
+          <w:color w:val="404040"/>
+          <w:sz w:val="20"/>
+        </w:rPr>
+      </w:pPr>
+      <w:r>
+        <w:rPr/>
+      </w:r>
+    </w:p>
+    <w:p>
+      <w:pPr>
+        <w:pStyle w:val="Normal"/>
         <w:pBdr>
           <w:bottom w:val="single" w:sz="4" w:space="1" w:color="000000"/>
         </w:pBdr>
@@ -2069,7 +3572,11 @@
         </w:rPr>
       </w:pPr>
       <w:r>
-        <w:rPr/>
+        <w:rPr>
+          <w:rFonts w:eastAsia="Arial" w:cs="Arial" w:ascii="Arial" w:hAnsi="Arial"/>
+          <w:color w:val="404040"/>
+          <w:sz w:val="20"/>
+        </w:rPr>
       </w:r>
     </w:p>
     <w:tbl>
@@ -2137,6 +3644,7 @@
           <w:p>
             <w:pPr>
               <w:pStyle w:val="Normal"/>
+              <w:widowControl w:val="false"/>
               <w:numPr>
                 <w:ilvl w:val="0"/>
                 <w:numId w:val="1"/>
@@ -2177,6 +3685,7 @@
           <w:p>
             <w:pPr>
               <w:pStyle w:val="Normal"/>
+              <w:widowControl w:val="false"/>
               <w:numPr>
                 <w:ilvl w:val="0"/>
                 <w:numId w:val="1"/>
@@ -2220,6 +3729,7 @@
     <w:p>
       <w:pPr>
         <w:pStyle w:val="Normal"/>
+        <w:spacing w:before="0" w:after="160"/>
         <w:rPr>
           <w:rFonts w:ascii="Aptos" w:hAnsi="Aptos" w:eastAsia="Aptos" w:cs="Aptos"/>
           <w:color w:val="404040"/>
@@ -2230,1617 +3740,11 @@
         <w:rPr/>
       </w:r>
     </w:p>
-    <w:p>
-      <w:pPr>
-        <w:sectPr>
-          <w:type w:val="nextPage"/>
-          <w:pgSz w:w="12240" w:h="15840"/>
-          <w:pgMar w:left="1441" w:right="1128" w:gutter="0" w:header="0" w:top="1108" w:footer="0" w:bottom="1143"/>
-          <w:pgNumType w:fmt="decimal"/>
-          <w:formProt w:val="false"/>
-          <w:textDirection w:val="lrTb"/>
-          <w:docGrid w:type="default" w:linePitch="100" w:charSpace="0"/>
-        </w:sectPr>
-      </w:pPr>
-    </w:p>
-    <w:p>
-      <w:pPr>
-        <w:pStyle w:val="Heading1"/>
-        <w:spacing w:before="0" w:after="132"/>
-        <w:ind w:left="-5" w:hanging="10"/>
-        <w:rPr/>
-      </w:pPr>
-      <w:r>
-        <w:rPr/>
-        <w:t xml:space="preserve">EXPERIENCE </w:t>
-      </w:r>
-    </w:p>
-    <w:p>
-      <w:pPr>
-        <w:pStyle w:val="Normal"/>
-        <w:spacing w:before="0" w:after="3"/>
-        <w:ind w:left="-5" w:hanging="10"/>
-        <w:rPr/>
-      </w:pPr>
-      <w:r>
-        <w:rPr>
-          <w:rFonts w:eastAsia="Aptos" w:cs="Aptos" w:ascii="Aptos" w:hAnsi="Aptos"/>
-          <w:b/>
-          <w:sz w:val="24"/>
-        </w:rPr>
-        <w:t xml:space="preserve">Dec 2024-Current </w:t>
-      </w:r>
-    </w:p>
-    <w:p>
-      <w:pPr>
-        <w:pStyle w:val="Heading2"/>
-        <w:spacing w:before="0" w:after="85"/>
-        <w:ind w:left="-5" w:hanging="10"/>
-        <w:rPr/>
-      </w:pPr>
-      <w:r>
-        <w:rPr/>
-        <w:t xml:space="preserve">Senior Developer | Tata Consultancy Services | Cigna | Postage Feature | Chennai </w:t>
-      </w:r>
-    </w:p>
-    <w:p>
-      <w:pPr>
-        <w:pStyle w:val="Normal"/>
-        <w:numPr>
-          <w:ilvl w:val="0"/>
-          <w:numId w:val="2"/>
-        </w:numPr>
-        <w:spacing w:lineRule="auto" w:line="252" w:before="0" w:after="3"/>
-        <w:ind w:left="706" w:hanging="360"/>
-        <w:rPr/>
-      </w:pPr>
-      <w:r>
-        <w:rPr>
-          <w:rFonts w:eastAsia="Aptos" w:cs="Aptos" w:ascii="Aptos" w:hAnsi="Aptos"/>
-          <w:sz w:val="24"/>
-        </w:rPr>
-        <w:t xml:space="preserve">Develop new programs / modify existing programs based on the requirements that were given by business analysts. </w:t>
-      </w:r>
-    </w:p>
-    <w:p>
-      <w:pPr>
-        <w:pStyle w:val="Normal"/>
-        <w:numPr>
-          <w:ilvl w:val="0"/>
-          <w:numId w:val="2"/>
-        </w:numPr>
-        <w:spacing w:lineRule="auto" w:line="252" w:before="0" w:after="3"/>
-        <w:ind w:left="706" w:hanging="360"/>
-        <w:rPr/>
-      </w:pPr>
-      <w:r>
-        <w:rPr>
-          <w:rFonts w:eastAsia="Aptos" w:cs="Aptos" w:ascii="Aptos" w:hAnsi="Aptos"/>
-          <w:sz w:val="24"/>
-        </w:rPr>
-        <w:t xml:space="preserve">Schedule a call for code walkthrough with business analysts and business to have a clear understanding of the requirements. </w:t>
-      </w:r>
-    </w:p>
-    <w:p>
-      <w:pPr>
-        <w:pStyle w:val="Normal"/>
-        <w:numPr>
-          <w:ilvl w:val="0"/>
-          <w:numId w:val="2"/>
-        </w:numPr>
-        <w:spacing w:lineRule="auto" w:line="252" w:before="0" w:after="3"/>
-        <w:ind w:left="706" w:hanging="360"/>
-        <w:rPr/>
-      </w:pPr>
-      <w:r>
-        <w:rPr>
-          <w:rFonts w:eastAsia="Aptos" w:cs="Aptos" w:ascii="Aptos" w:hAnsi="Aptos"/>
-          <w:sz w:val="24"/>
-        </w:rPr>
-        <w:t xml:space="preserve">Update daily status to business folks through email / Scrum call with respect to the project. </w:t>
-      </w:r>
-    </w:p>
-    <w:p>
-      <w:pPr>
-        <w:pStyle w:val="Normal"/>
-        <w:numPr>
-          <w:ilvl w:val="0"/>
-          <w:numId w:val="2"/>
-        </w:numPr>
-        <w:spacing w:lineRule="auto" w:line="252" w:before="0" w:after="3"/>
-        <w:ind w:left="706" w:hanging="360"/>
-        <w:rPr/>
-      </w:pPr>
-      <w:r>
-        <w:rPr>
-          <w:rFonts w:eastAsia="Aptos" w:cs="Aptos" w:ascii="Aptos" w:hAnsi="Aptos"/>
-          <w:sz w:val="24"/>
-        </w:rPr>
-        <w:t xml:space="preserve">Improving and streamlining the business process by scheduling walkthroughs with business analysts to understand the requirements. </w:t>
-      </w:r>
-    </w:p>
-    <w:p>
-      <w:pPr>
-        <w:pStyle w:val="Normal"/>
-        <w:numPr>
-          <w:ilvl w:val="0"/>
-          <w:numId w:val="2"/>
-        </w:numPr>
-        <w:spacing w:lineRule="auto" w:line="252" w:before="0" w:after="3"/>
-        <w:ind w:left="706" w:hanging="360"/>
-        <w:rPr/>
-      </w:pPr>
-      <w:r>
-        <w:rPr>
-          <w:rFonts w:eastAsia="Aptos" w:cs="Aptos" w:ascii="Aptos" w:hAnsi="Aptos"/>
-          <w:sz w:val="24"/>
-        </w:rPr>
-        <w:t xml:space="preserve">Work closely with technical architects to develop solutions. </w:t>
-      </w:r>
-      <w:r>
-        <w:rPr>
-          <w:rFonts w:eastAsia="Segoe UI Symbol" w:cs="Segoe UI Symbol" w:ascii="Segoe UI Symbol" w:hAnsi="Segoe UI Symbol"/>
-          <w:sz w:val="24"/>
-        </w:rPr>
-        <w:t>•</w:t>
-      </w:r>
-      <w:r>
-        <w:rPr>
-          <w:rFonts w:eastAsia="Arial" w:cs="Arial" w:ascii="Arial" w:hAnsi="Arial"/>
-          <w:sz w:val="24"/>
-        </w:rPr>
-        <w:t xml:space="preserve"> </w:t>
-      </w:r>
-      <w:r>
-        <w:rPr>
-          <w:rFonts w:eastAsia="Arial" w:cs="Arial" w:ascii="Arial" w:hAnsi="Arial"/>
-        </w:rPr>
-        <w:t>P</w:t>
-      </w:r>
-      <w:r>
-        <w:rPr>
-          <w:rFonts w:eastAsia="Arial" w:cs="Arial" w:ascii="Arial" w:hAnsi="Arial"/>
-          <w:sz w:val="24"/>
-        </w:rPr>
-        <w:t>eer Review the code and provide feedback and comments.</w:t>
-      </w:r>
-      <w:r>
-        <w:rPr>
-          <w:rFonts w:eastAsia="Aptos" w:cs="Aptos" w:ascii="Aptos" w:hAnsi="Aptos"/>
-          <w:sz w:val="24"/>
-        </w:rPr>
-        <w:t xml:space="preserve"> </w:t>
-      </w:r>
-    </w:p>
-    <w:p>
-      <w:pPr>
-        <w:pStyle w:val="Normal"/>
-        <w:numPr>
-          <w:ilvl w:val="0"/>
-          <w:numId w:val="2"/>
-        </w:numPr>
-        <w:spacing w:lineRule="auto" w:line="252" w:before="0" w:after="3"/>
-        <w:ind w:left="706" w:hanging="360"/>
-        <w:rPr/>
-      </w:pPr>
-      <w:r>
-        <w:rPr>
-          <w:rFonts w:eastAsia="Aptos" w:cs="Aptos" w:ascii="Aptos" w:hAnsi="Aptos"/>
-          <w:sz w:val="24"/>
-        </w:rPr>
-        <w:t xml:space="preserve">Assisted clients and business partners with questions and problems- involving configurations. </w:t>
-      </w:r>
-    </w:p>
-    <w:p>
-      <w:pPr>
-        <w:pStyle w:val="Normal"/>
-        <w:numPr>
-          <w:ilvl w:val="0"/>
-          <w:numId w:val="2"/>
-        </w:numPr>
-        <w:spacing w:lineRule="auto" w:line="252" w:before="0" w:after="3"/>
-        <w:ind w:left="706" w:hanging="360"/>
-        <w:rPr/>
-      </w:pPr>
-      <w:r>
-        <w:rPr>
-          <w:rFonts w:eastAsia="Aptos" w:cs="Aptos" w:ascii="Aptos" w:hAnsi="Aptos"/>
-          <w:sz w:val="24"/>
-        </w:rPr>
-        <w:t xml:space="preserve">Managed and provided solution to multiple simultaneous customers asks/requests. </w:t>
-      </w:r>
-    </w:p>
-    <w:p>
-      <w:pPr>
-        <w:pStyle w:val="Normal"/>
-        <w:numPr>
-          <w:ilvl w:val="0"/>
-          <w:numId w:val="2"/>
-        </w:numPr>
-        <w:spacing w:lineRule="auto" w:line="252" w:before="0" w:after="3"/>
-        <w:ind w:left="706" w:hanging="360"/>
-        <w:rPr/>
-      </w:pPr>
-      <w:r>
-        <w:rPr>
-          <w:rFonts w:eastAsia="Aptos" w:cs="Aptos" w:ascii="Aptos" w:hAnsi="Aptos"/>
-          <w:sz w:val="24"/>
-        </w:rPr>
-        <w:t xml:space="preserve">Monitor the job during production run / various non-production environments and communicate to stakeholders on the status daily basis </w:t>
-      </w:r>
-    </w:p>
-    <w:p>
-      <w:pPr>
-        <w:pStyle w:val="Normal"/>
-        <w:spacing w:before="0" w:after="0"/>
-        <w:ind w:left="361" w:hanging="0"/>
-        <w:rPr/>
-      </w:pPr>
-      <w:r>
-        <w:rPr>
-          <w:rFonts w:eastAsia="Aptos" w:cs="Aptos" w:ascii="Aptos" w:hAnsi="Aptos"/>
-          <w:sz w:val="24"/>
-        </w:rPr>
-        <w:t xml:space="preserve"> </w:t>
-      </w:r>
-    </w:p>
-    <w:p>
-      <w:pPr>
-        <w:pStyle w:val="Normal"/>
-        <w:spacing w:before="0" w:after="3"/>
-        <w:ind w:left="-5" w:hanging="10"/>
-        <w:rPr/>
-      </w:pPr>
-      <w:r>
-        <w:rPr>
-          <w:rFonts w:eastAsia="Aptos" w:cs="Aptos" w:ascii="Aptos" w:hAnsi="Aptos"/>
-          <w:b/>
-          <w:sz w:val="24"/>
-        </w:rPr>
-        <w:t xml:space="preserve">Nov 2019 - Nov 2024 </w:t>
-      </w:r>
-    </w:p>
-    <w:p>
-      <w:pPr>
-        <w:pStyle w:val="Heading2"/>
-        <w:spacing w:before="0" w:after="92"/>
-        <w:ind w:left="-5" w:hanging="10"/>
-        <w:rPr/>
-      </w:pPr>
-      <w:r>
-        <w:rPr/>
-        <w:t xml:space="preserve">Information Security Manager – Dual Role | Tata Consultancy Services | Kaiser Permanente| Security Compliance and Audits | All TCS Kaiser Operating Locations | </w:t>
-      </w:r>
-    </w:p>
-    <w:p>
-      <w:pPr>
-        <w:pStyle w:val="Normal"/>
-        <w:numPr>
-          <w:ilvl w:val="0"/>
-          <w:numId w:val="3"/>
-        </w:numPr>
-        <w:spacing w:lineRule="auto" w:line="252" w:before="0" w:after="3"/>
-        <w:ind w:left="706" w:hanging="360"/>
-        <w:rPr/>
-      </w:pPr>
-      <w:r>
-        <w:rPr>
-          <w:rFonts w:eastAsia="Aptos" w:cs="Aptos" w:ascii="Aptos" w:hAnsi="Aptos"/>
-          <w:sz w:val="24"/>
-        </w:rPr>
-        <w:t xml:space="preserve">Representing TCS for the account in Customer Audits. </w:t>
-      </w:r>
-    </w:p>
-    <w:p>
-      <w:pPr>
-        <w:pStyle w:val="Normal"/>
-        <w:numPr>
-          <w:ilvl w:val="0"/>
-          <w:numId w:val="3"/>
-        </w:numPr>
-        <w:spacing w:lineRule="auto" w:line="252" w:before="0" w:after="3"/>
-        <w:ind w:left="706" w:hanging="360"/>
-        <w:rPr/>
-      </w:pPr>
-      <w:r>
-        <w:rPr>
-          <w:rFonts w:eastAsia="Aptos" w:cs="Aptos" w:ascii="Aptos" w:hAnsi="Aptos"/>
-          <w:sz w:val="24"/>
-        </w:rPr>
-        <w:t xml:space="preserve">Taking up Internal Audits conducted by TCS for account. </w:t>
-      </w:r>
-    </w:p>
-    <w:p>
-      <w:pPr>
-        <w:pStyle w:val="Normal"/>
-        <w:numPr>
-          <w:ilvl w:val="0"/>
-          <w:numId w:val="3"/>
-        </w:numPr>
-        <w:spacing w:lineRule="auto" w:line="252" w:before="0" w:after="3"/>
-        <w:ind w:left="706" w:hanging="360"/>
-        <w:rPr/>
-      </w:pPr>
-      <w:r>
-        <w:rPr>
-          <w:rFonts w:eastAsia="Aptos" w:cs="Aptos" w:ascii="Aptos" w:hAnsi="Aptos"/>
-          <w:sz w:val="24"/>
-        </w:rPr>
-        <w:t xml:space="preserve">Maintaining and ensuing that the account is compliant in all security key factors through thorough monitoring. </w:t>
-      </w:r>
-    </w:p>
-    <w:p>
-      <w:pPr>
-        <w:pStyle w:val="Normal"/>
-        <w:numPr>
-          <w:ilvl w:val="0"/>
-          <w:numId w:val="3"/>
-        </w:numPr>
-        <w:spacing w:lineRule="auto" w:line="252" w:before="0" w:after="3"/>
-        <w:ind w:left="706" w:hanging="360"/>
-        <w:rPr/>
-      </w:pPr>
-      <w:r>
-        <w:rPr>
-          <w:rFonts w:eastAsia="Aptos" w:cs="Aptos" w:ascii="Aptos" w:hAnsi="Aptos"/>
-          <w:sz w:val="24"/>
-        </w:rPr>
-        <w:t xml:space="preserve">Ensure proper knowledge in security management and customer policies are spread across all associates in the account by conducting Security session to all associates. </w:t>
-      </w:r>
-    </w:p>
-    <w:p>
-      <w:pPr>
-        <w:pStyle w:val="Normal"/>
-        <w:numPr>
-          <w:ilvl w:val="0"/>
-          <w:numId w:val="3"/>
-        </w:numPr>
-        <w:spacing w:lineRule="auto" w:line="252" w:before="0" w:after="3"/>
-        <w:ind w:left="706" w:hanging="360"/>
-        <w:rPr/>
-      </w:pPr>
-      <w:r>
-        <w:rPr>
-          <w:rFonts w:eastAsia="Aptos" w:cs="Aptos" w:ascii="Aptos" w:hAnsi="Aptos"/>
-          <w:sz w:val="24"/>
-        </w:rPr>
-        <w:t xml:space="preserve">Reporting and investigation of security incidents and triaging them through calls connecting with the client vendor management support team to ensure they are getting closed with proper mitigation plan. </w:t>
-      </w:r>
-    </w:p>
-    <w:p>
-      <w:pPr>
-        <w:pStyle w:val="Normal"/>
-        <w:numPr>
-          <w:ilvl w:val="0"/>
-          <w:numId w:val="3"/>
-        </w:numPr>
-        <w:spacing w:lineRule="auto" w:line="252" w:before="0" w:after="3"/>
-        <w:ind w:left="706" w:hanging="360"/>
-        <w:rPr/>
-      </w:pPr>
-      <w:r>
-        <w:rPr>
-          <w:rFonts w:eastAsia="Aptos" w:cs="Aptos" w:ascii="Aptos" w:hAnsi="Aptos"/>
-          <w:sz w:val="24"/>
-        </w:rPr>
-        <w:t xml:space="preserve">Audit tracking, closure of NCs and findings that was tracked as part of internal and external client audits. </w:t>
-      </w:r>
-    </w:p>
-    <w:p>
-      <w:pPr>
-        <w:pStyle w:val="Normal"/>
-        <w:numPr>
-          <w:ilvl w:val="0"/>
-          <w:numId w:val="3"/>
-        </w:numPr>
-        <w:spacing w:lineRule="auto" w:line="252" w:before="0" w:after="3"/>
-        <w:ind w:left="706" w:hanging="360"/>
-        <w:rPr/>
-      </w:pPr>
-      <w:r>
-        <w:rPr>
-          <w:rFonts w:eastAsia="Aptos" w:cs="Aptos" w:ascii="Aptos" w:hAnsi="Aptos"/>
-          <w:sz w:val="24"/>
-        </w:rPr>
-        <w:t xml:space="preserve">Documentation and tracking of reports for all the finding and closure of them promptly. </w:t>
-      </w:r>
-    </w:p>
-    <w:p>
-      <w:pPr>
-        <w:pStyle w:val="Normal"/>
-        <w:numPr>
-          <w:ilvl w:val="0"/>
-          <w:numId w:val="3"/>
-        </w:numPr>
-        <w:spacing w:lineRule="auto" w:line="252" w:before="0" w:after="212"/>
-        <w:ind w:left="706" w:hanging="360"/>
-        <w:rPr/>
-      </w:pPr>
-      <w:r>
-        <w:rPr>
-          <w:rFonts w:eastAsia="Arial" w:cs="Arial" w:ascii="Arial" w:hAnsi="Arial"/>
-        </w:rPr>
-        <w:t>C</w:t>
-      </w:r>
-      <w:r>
-        <w:rPr>
-          <w:rFonts w:eastAsia="Arial" w:cs="Arial" w:ascii="Arial" w:hAnsi="Arial"/>
-          <w:sz w:val="24"/>
-        </w:rPr>
-        <w:t>ollaboration with the different location security SPOCs and carrying out centralized activities from Chennai location for all crucial security compliance activitie</w:t>
-      </w:r>
-      <w:r>
-        <w:rPr>
-          <w:rFonts w:eastAsia="Arial" w:cs="Arial" w:ascii="Arial" w:hAnsi="Arial"/>
-        </w:rPr>
-        <w:t>s.</w:t>
-      </w:r>
-      <w:r>
-        <w:rPr>
-          <w:rFonts w:eastAsia="Arial" w:cs="Arial" w:ascii="Arial" w:hAnsi="Arial"/>
-          <w:color w:val="404040"/>
-          <w:sz w:val="20"/>
-        </w:rPr>
-        <w:t xml:space="preserve"> </w:t>
-      </w:r>
-    </w:p>
-    <w:p>
-      <w:pPr>
-        <w:pStyle w:val="Normal"/>
-        <w:spacing w:before="0" w:after="32"/>
-        <w:rPr/>
-      </w:pPr>
-      <w:r>
-        <w:rPr>
-          <w:rFonts w:eastAsia="Arial" w:cs="Arial" w:ascii="Arial" w:hAnsi="Arial"/>
-          <w:color w:val="404040"/>
-          <w:sz w:val="20"/>
-        </w:rPr>
-        <w:t xml:space="preserve"> </w:t>
-      </w:r>
-    </w:p>
-    <w:p>
-      <w:pPr>
-        <w:pStyle w:val="Normal"/>
-        <w:spacing w:before="0" w:after="3"/>
-        <w:ind w:left="-5" w:hanging="10"/>
-        <w:rPr/>
-      </w:pPr>
-      <w:r>
-        <w:rPr>
-          <w:rFonts w:eastAsia="Aptos" w:cs="Aptos" w:ascii="Aptos" w:hAnsi="Aptos"/>
-          <w:b/>
-          <w:sz w:val="24"/>
-        </w:rPr>
-        <w:t xml:space="preserve">Oct 2016 - Nov 2024 </w:t>
-      </w:r>
-    </w:p>
-    <w:p>
-      <w:pPr>
-        <w:pStyle w:val="Normal"/>
-        <w:spacing w:before="0" w:after="3"/>
-        <w:ind w:left="-5" w:hanging="10"/>
-        <w:rPr/>
-      </w:pPr>
-      <w:r>
-        <w:rPr>
-          <w:rFonts w:eastAsia="Aptos" w:cs="Aptos" w:ascii="Aptos" w:hAnsi="Aptos"/>
-          <w:b/>
-          <w:sz w:val="24"/>
-        </w:rPr>
-        <w:t xml:space="preserve">Team Lead | Tata Consultancy Services | Kaiser Permanente| Medicare Business Engine - </w:t>
-      </w:r>
-    </w:p>
-    <w:p>
-      <w:pPr>
-        <w:pStyle w:val="Heading2"/>
-        <w:spacing w:before="0" w:after="85"/>
-        <w:ind w:left="-5" w:hanging="10"/>
-        <w:rPr/>
-      </w:pPr>
-      <w:r>
-        <w:rPr/>
-        <w:t xml:space="preserve">Development | Chennai </w:t>
-      </w:r>
-    </w:p>
-    <w:p>
-      <w:pPr>
-        <w:pStyle w:val="Normal"/>
-        <w:numPr>
-          <w:ilvl w:val="0"/>
-          <w:numId w:val="4"/>
-        </w:numPr>
-        <w:spacing w:lineRule="auto" w:line="252" w:before="0" w:after="3"/>
-        <w:ind w:left="706" w:hanging="360"/>
-        <w:rPr/>
-      </w:pPr>
-      <w:r>
-        <w:rPr>
-          <w:rFonts w:eastAsia="Aptos" w:cs="Aptos" w:ascii="Aptos" w:hAnsi="Aptos"/>
-          <w:sz w:val="24"/>
-        </w:rPr>
-        <w:t xml:space="preserve">Analysis, Design and Implementation of Applications using Oracle RDBMS. </w:t>
-      </w:r>
-    </w:p>
-    <w:p>
-      <w:pPr>
-        <w:pStyle w:val="Normal"/>
-        <w:numPr>
-          <w:ilvl w:val="0"/>
-          <w:numId w:val="4"/>
-        </w:numPr>
-        <w:spacing w:lineRule="auto" w:line="252" w:before="0" w:after="3"/>
-        <w:ind w:left="706" w:hanging="360"/>
-        <w:rPr/>
-      </w:pPr>
-      <w:r>
-        <w:rPr>
-          <w:rFonts w:eastAsia="Aptos" w:cs="Aptos" w:ascii="Aptos" w:hAnsi="Aptos"/>
-          <w:sz w:val="24"/>
-        </w:rPr>
-        <w:t xml:space="preserve">Implementation of decoupled and clean architecture for business applications. </w:t>
-      </w:r>
-    </w:p>
-    <w:p>
-      <w:pPr>
-        <w:pStyle w:val="Normal"/>
-        <w:numPr>
-          <w:ilvl w:val="0"/>
-          <w:numId w:val="4"/>
-        </w:numPr>
-        <w:spacing w:lineRule="auto" w:line="252" w:before="0" w:after="3"/>
-        <w:ind w:left="706" w:hanging="360"/>
-        <w:rPr/>
-      </w:pPr>
-      <w:r>
-        <w:rPr>
-          <w:rFonts w:eastAsia="Aptos" w:cs="Aptos" w:ascii="Aptos" w:hAnsi="Aptos"/>
-          <w:sz w:val="24"/>
-        </w:rPr>
-        <w:t xml:space="preserve">Developed Complex Database Objects like Stored Procedure, Packages, Functions and Triggers using SQL and PL/SQL. </w:t>
-      </w:r>
-    </w:p>
-    <w:p>
-      <w:pPr>
-        <w:pStyle w:val="Normal"/>
-        <w:numPr>
-          <w:ilvl w:val="0"/>
-          <w:numId w:val="4"/>
-        </w:numPr>
-        <w:spacing w:lineRule="auto" w:line="252" w:before="0" w:after="3"/>
-        <w:ind w:left="706" w:hanging="360"/>
-        <w:rPr/>
-      </w:pPr>
-      <w:r>
-        <w:rPr>
-          <w:rFonts w:eastAsia="Aptos" w:cs="Aptos" w:ascii="Aptos" w:hAnsi="Aptos"/>
-          <w:sz w:val="24"/>
-        </w:rPr>
-        <w:t>Ongoing performance tuning activities on PL/SQL Programs</w:t>
-      </w:r>
-      <w:r>
-        <w:rPr>
-          <w:rFonts w:eastAsia="Arial" w:cs="Arial" w:ascii="Arial" w:hAnsi="Arial"/>
-          <w:color w:val="404040"/>
-          <w:sz w:val="20"/>
-        </w:rPr>
-        <w:t xml:space="preserve"> </w:t>
-      </w:r>
-    </w:p>
-    <w:p>
-      <w:pPr>
-        <w:pStyle w:val="Normal"/>
-        <w:numPr>
-          <w:ilvl w:val="0"/>
-          <w:numId w:val="4"/>
-        </w:numPr>
-        <w:spacing w:lineRule="auto" w:line="252" w:before="0" w:after="4"/>
-        <w:ind w:left="706" w:hanging="360"/>
-        <w:rPr/>
-      </w:pPr>
-      <w:r>
-        <w:rPr>
-          <w:rFonts w:eastAsia="Aptos" w:cs="Aptos" w:ascii="Aptos" w:hAnsi="Aptos"/>
-          <w:sz w:val="24"/>
-        </w:rPr>
-        <w:t>C</w:t>
-      </w:r>
-      <w:r>
-        <w:rPr>
-          <w:rFonts w:eastAsia="Arial" w:cs="Arial" w:ascii="Arial" w:hAnsi="Arial"/>
-          <w:sz w:val="24"/>
-        </w:rPr>
-        <w:t>oordinated with front end design team to provide them with necessary stored</w:t>
-      </w:r>
-      <w:r>
-        <w:rPr>
-          <w:rFonts w:eastAsia="Aptos" w:cs="Aptos" w:ascii="Aptos" w:hAnsi="Aptos"/>
-          <w:sz w:val="24"/>
-        </w:rPr>
-        <w:t xml:space="preserve"> </w:t>
-      </w:r>
-      <w:r>
-        <w:rPr>
-          <w:rFonts w:eastAsia="Segoe UI Symbol" w:cs="Segoe UI Symbol" w:ascii="Segoe UI Symbol" w:hAnsi="Segoe UI Symbol"/>
-          <w:color w:val="404040"/>
-          <w:sz w:val="20"/>
-        </w:rPr>
-        <w:t>•</w:t>
-      </w:r>
-      <w:r>
-        <w:rPr>
-          <w:rFonts w:eastAsia="Arial" w:cs="Arial" w:ascii="Arial" w:hAnsi="Arial"/>
-          <w:color w:val="404040"/>
-          <w:sz w:val="31"/>
-          <w:vertAlign w:val="subscript"/>
-        </w:rPr>
-        <w:t xml:space="preserve"> </w:t>
-      </w:r>
-      <w:r>
-        <w:rPr>
-          <w:rFonts w:eastAsia="Aptos" w:cs="Aptos" w:ascii="Aptos" w:hAnsi="Aptos"/>
-          <w:sz w:val="24"/>
-        </w:rPr>
-        <w:t>procedures, triggers and packages using SQL and PL/SQL.</w:t>
-      </w:r>
-      <w:r>
-        <w:rPr>
-          <w:rFonts w:eastAsia="Aptos" w:cs="Aptos" w:ascii="Aptos" w:hAnsi="Aptos"/>
-          <w:color w:val="404040"/>
-          <w:sz w:val="20"/>
-        </w:rPr>
-        <w:t xml:space="preserve"> </w:t>
-      </w:r>
-    </w:p>
-    <w:p>
-      <w:pPr>
-        <w:pStyle w:val="Normal"/>
-        <w:numPr>
-          <w:ilvl w:val="0"/>
-          <w:numId w:val="4"/>
-        </w:numPr>
-        <w:spacing w:lineRule="auto" w:line="252" w:before="0" w:after="4"/>
-        <w:ind w:left="706" w:hanging="360"/>
-        <w:rPr/>
-      </w:pPr>
-      <w:r>
-        <w:rPr>
-          <w:rFonts w:eastAsia="Arial" w:cs="Arial" w:ascii="Arial" w:hAnsi="Arial"/>
-        </w:rPr>
-        <w:t>S</w:t>
-      </w:r>
-      <w:r>
-        <w:rPr>
-          <w:rFonts w:eastAsia="Arial" w:cs="Arial" w:ascii="Arial" w:hAnsi="Arial"/>
-          <w:sz w:val="24"/>
-        </w:rPr>
-        <w:t>upport system / UA testing / QA / other environments of the code that got released for testing.</w:t>
-      </w:r>
-      <w:r>
-        <w:rPr>
-          <w:rFonts w:eastAsia="Aptos" w:cs="Aptos" w:ascii="Aptos" w:hAnsi="Aptos"/>
-          <w:color w:val="404040"/>
-          <w:sz w:val="20"/>
-        </w:rPr>
-        <w:t xml:space="preserve"> </w:t>
-      </w:r>
-    </w:p>
-    <w:p>
-      <w:pPr>
-        <w:pStyle w:val="Normal"/>
-        <w:numPr>
-          <w:ilvl w:val="0"/>
-          <w:numId w:val="4"/>
-        </w:numPr>
-        <w:spacing w:lineRule="auto" w:line="252" w:before="0" w:after="3"/>
-        <w:ind w:left="706" w:hanging="360"/>
-        <w:rPr/>
-      </w:pPr>
-      <w:r>
-        <w:rPr>
-          <w:rFonts w:eastAsia="Aptos" w:cs="Aptos" w:ascii="Aptos" w:hAnsi="Aptos"/>
-          <w:sz w:val="24"/>
-        </w:rPr>
-        <w:t xml:space="preserve">Update Project status to business folks through email / call recursively. </w:t>
-      </w:r>
-    </w:p>
-    <w:p>
-      <w:pPr>
-        <w:pStyle w:val="Normal"/>
-        <w:numPr>
-          <w:ilvl w:val="0"/>
-          <w:numId w:val="4"/>
-        </w:numPr>
-        <w:spacing w:lineRule="auto" w:line="252" w:before="0" w:after="3"/>
-        <w:ind w:left="706" w:hanging="360"/>
-        <w:rPr/>
-      </w:pPr>
-      <w:r>
-        <w:rPr>
-          <w:rFonts w:eastAsia="Aptos" w:cs="Aptos" w:ascii="Aptos" w:hAnsi="Aptos"/>
-          <w:sz w:val="24"/>
-        </w:rPr>
-        <w:t xml:space="preserve">Validate and peer review the code of developers with feedback </w:t>
-      </w:r>
-    </w:p>
-    <w:p>
-      <w:pPr>
-        <w:pStyle w:val="Normal"/>
-        <w:numPr>
-          <w:ilvl w:val="0"/>
-          <w:numId w:val="4"/>
-        </w:numPr>
-        <w:spacing w:lineRule="auto" w:line="252" w:before="0" w:after="3"/>
-        <w:ind w:left="706" w:hanging="360"/>
-        <w:rPr/>
-      </w:pPr>
-      <w:r>
-        <w:rPr>
-          <w:rFonts w:eastAsia="Aptos" w:cs="Aptos" w:ascii="Aptos" w:hAnsi="Aptos"/>
-          <w:sz w:val="24"/>
-        </w:rPr>
-        <w:t>Coordinate and Manage Code walkthroughs with Business Team for every release.</w:t>
-      </w:r>
-      <w:r>
-        <w:rPr>
-          <w:rFonts w:eastAsia="Aptos" w:cs="Aptos" w:ascii="Aptos" w:hAnsi="Aptos"/>
-          <w:color w:val="404040"/>
-          <w:sz w:val="20"/>
-        </w:rPr>
-        <w:t xml:space="preserve"> </w:t>
-      </w:r>
-    </w:p>
-    <w:p>
-      <w:pPr>
-        <w:pStyle w:val="Normal"/>
-        <w:spacing w:before="0" w:after="16"/>
-        <w:rPr/>
-      </w:pPr>
-      <w:r>
-        <w:rPr>
-          <w:rFonts w:eastAsia="Aptos" w:cs="Aptos" w:ascii="Aptos" w:hAnsi="Aptos"/>
-          <w:color w:val="404040"/>
-          <w:sz w:val="20"/>
-        </w:rPr>
-        <w:t xml:space="preserve"> </w:t>
-      </w:r>
-    </w:p>
-    <w:p>
-      <w:pPr>
-        <w:pStyle w:val="Normal"/>
-        <w:spacing w:before="0" w:after="3"/>
-        <w:ind w:left="-5" w:hanging="10"/>
-        <w:rPr/>
-      </w:pPr>
-      <w:r>
-        <w:rPr>
-          <w:rFonts w:eastAsia="Aptos" w:cs="Aptos" w:ascii="Aptos" w:hAnsi="Aptos"/>
-          <w:b/>
-          <w:sz w:val="24"/>
-        </w:rPr>
-        <w:t xml:space="preserve">Oct 2014 - Oct 2016 </w:t>
-      </w:r>
-    </w:p>
-    <w:p>
-      <w:pPr>
-        <w:pStyle w:val="Normal"/>
-        <w:spacing w:before="0" w:after="3"/>
-        <w:ind w:left="-5" w:hanging="10"/>
-        <w:rPr/>
-      </w:pPr>
-      <w:r>
-        <w:rPr>
-          <w:rFonts w:eastAsia="Aptos" w:cs="Aptos" w:ascii="Aptos" w:hAnsi="Aptos"/>
-          <w:b/>
-          <w:sz w:val="24"/>
-        </w:rPr>
-        <w:t xml:space="preserve">Developer | Tata Consultancy Services | Kaiser Permanente| Benefits Enhancement </w:t>
-      </w:r>
-    </w:p>
-    <w:p>
-      <w:pPr>
-        <w:pStyle w:val="Heading2"/>
-        <w:ind w:left="-5" w:hanging="10"/>
-        <w:rPr/>
-      </w:pPr>
-      <w:r>
-        <w:rPr/>
-        <w:t xml:space="preserve">Tracking System - Development| Chennai </w:t>
-      </w:r>
-    </w:p>
-    <w:p>
-      <w:pPr>
-        <w:pStyle w:val="Normal"/>
-        <w:spacing w:before="0" w:after="0"/>
-        <w:rPr/>
-      </w:pPr>
-      <w:r>
-        <w:rPr>
-          <w:rFonts w:eastAsia="Aptos" w:cs="Aptos" w:ascii="Aptos" w:hAnsi="Aptos"/>
-          <w:sz w:val="24"/>
-        </w:rPr>
-        <w:t xml:space="preserve"> </w:t>
-      </w:r>
-    </w:p>
-    <w:p>
-      <w:pPr>
-        <w:pStyle w:val="Normal"/>
-        <w:numPr>
-          <w:ilvl w:val="0"/>
-          <w:numId w:val="5"/>
-        </w:numPr>
-        <w:spacing w:lineRule="auto" w:line="252" w:before="0" w:after="4"/>
-        <w:ind w:left="706" w:hanging="360"/>
-        <w:rPr/>
-      </w:pPr>
-      <w:r>
-        <w:rPr>
-          <w:rFonts w:eastAsia="Arial" w:cs="Arial" w:ascii="Arial" w:hAnsi="Arial"/>
-          <w:sz w:val="24"/>
-        </w:rPr>
-        <w:t xml:space="preserve">Involved in all phases of the SDLC (Software Development Life Cycle) </w:t>
-      </w:r>
-    </w:p>
-    <w:p>
-      <w:pPr>
-        <w:pStyle w:val="Normal"/>
-        <w:numPr>
-          <w:ilvl w:val="0"/>
-          <w:numId w:val="5"/>
-        </w:numPr>
-        <w:spacing w:lineRule="auto" w:line="252" w:before="0" w:after="4"/>
-        <w:ind w:left="706" w:hanging="360"/>
-        <w:rPr/>
-      </w:pPr>
-      <w:r>
-        <w:rPr>
-          <w:rFonts w:eastAsia="Arial" w:cs="Arial" w:ascii="Arial" w:hAnsi="Arial"/>
-          <w:sz w:val="24"/>
-        </w:rPr>
-        <w:t xml:space="preserve">Requirements gathering and translating it into design document. </w:t>
-      </w:r>
-    </w:p>
-    <w:p>
-      <w:pPr>
-        <w:pStyle w:val="Normal"/>
-        <w:numPr>
-          <w:ilvl w:val="0"/>
-          <w:numId w:val="5"/>
-        </w:numPr>
-        <w:spacing w:lineRule="auto" w:line="252" w:before="0" w:after="4"/>
-        <w:ind w:left="706" w:hanging="360"/>
-        <w:rPr/>
-      </w:pPr>
-      <w:r>
-        <w:rPr>
-          <w:rFonts w:eastAsia="Arial" w:cs="Arial" w:ascii="Arial" w:hAnsi="Arial"/>
-          <w:sz w:val="24"/>
-        </w:rPr>
-        <w:t xml:space="preserve">Development, testing and implementation of code ensuring timely delivery against aggressive deadlines. </w:t>
-      </w:r>
-    </w:p>
-    <w:p>
-      <w:pPr>
-        <w:pStyle w:val="Normal"/>
-        <w:numPr>
-          <w:ilvl w:val="0"/>
-          <w:numId w:val="5"/>
-        </w:numPr>
-        <w:spacing w:lineRule="auto" w:line="252" w:before="0" w:after="4"/>
-        <w:ind w:left="706" w:hanging="360"/>
-        <w:rPr/>
-      </w:pPr>
-      <w:r>
-        <w:rPr>
-          <w:rFonts w:eastAsia="Arial" w:cs="Arial" w:ascii="Arial" w:hAnsi="Arial"/>
-          <w:sz w:val="24"/>
-        </w:rPr>
-        <w:t xml:space="preserve">Developed Materialized view for data replication in distributed environments. </w:t>
-      </w:r>
-    </w:p>
-    <w:p>
-      <w:pPr>
-        <w:pStyle w:val="Normal"/>
-        <w:numPr>
-          <w:ilvl w:val="0"/>
-          <w:numId w:val="5"/>
-        </w:numPr>
-        <w:spacing w:lineRule="auto" w:line="252" w:before="0" w:after="4"/>
-        <w:ind w:left="706" w:hanging="360"/>
-        <w:rPr/>
-      </w:pPr>
-      <w:r>
-        <w:rPr>
-          <w:rFonts w:eastAsia="Arial" w:cs="Arial" w:ascii="Arial" w:hAnsi="Arial"/>
-          <w:sz w:val="24"/>
-        </w:rPr>
-        <w:t xml:space="preserve">Effectively made use of Table Functions, Indexes, Collections, Materialized Views and Query Re-Write. </w:t>
-      </w:r>
-    </w:p>
-    <w:p>
-      <w:pPr>
-        <w:pStyle w:val="Normal"/>
-        <w:numPr>
-          <w:ilvl w:val="0"/>
-          <w:numId w:val="5"/>
-        </w:numPr>
-        <w:spacing w:lineRule="auto" w:line="252" w:before="0" w:after="4"/>
-        <w:ind w:left="706" w:hanging="360"/>
-        <w:rPr/>
-      </w:pPr>
-      <w:r>
-        <w:rPr>
-          <w:rFonts w:eastAsia="Arial" w:cs="Arial" w:ascii="Arial" w:hAnsi="Arial"/>
-          <w:sz w:val="24"/>
-        </w:rPr>
-        <w:t xml:space="preserve">Developed Web forms that have been used extensively in ASP.NET for FE  </w:t>
-      </w:r>
-    </w:p>
-    <w:p>
-      <w:pPr>
-        <w:pStyle w:val="Normal"/>
-        <w:numPr>
-          <w:ilvl w:val="0"/>
-          <w:numId w:val="5"/>
-        </w:numPr>
-        <w:spacing w:lineRule="auto" w:line="252" w:before="0" w:after="4"/>
-        <w:ind w:left="706" w:hanging="360"/>
-        <w:rPr/>
-      </w:pPr>
-      <w:r>
-        <w:rPr>
-          <w:rFonts w:eastAsia="Arial" w:cs="Arial" w:ascii="Arial" w:hAnsi="Arial"/>
-          <w:sz w:val="24"/>
-        </w:rPr>
-        <w:t xml:space="preserve">Expertise in creating visually appealing user interface with CSS </w:t>
-      </w:r>
-    </w:p>
-    <w:p>
-      <w:pPr>
-        <w:pStyle w:val="Normal"/>
-        <w:numPr>
-          <w:ilvl w:val="0"/>
-          <w:numId w:val="5"/>
-        </w:numPr>
-        <w:spacing w:lineRule="auto" w:line="252" w:before="0" w:after="4"/>
-        <w:ind w:left="706" w:hanging="360"/>
-        <w:rPr/>
-      </w:pPr>
-      <w:r>
-        <w:rPr>
-          <w:rFonts w:eastAsia="Arial" w:cs="Arial" w:ascii="Arial" w:hAnsi="Arial"/>
-          <w:sz w:val="24"/>
-        </w:rPr>
-        <w:t xml:space="preserve">Coordinate knowledge transition to production support team on the changes that were deployed into production as part of Dev releases. </w:t>
-      </w:r>
-    </w:p>
-    <w:p>
-      <w:pPr>
-        <w:pStyle w:val="Normal"/>
-        <w:spacing w:before="0" w:after="0"/>
-        <w:rPr/>
-      </w:pPr>
-      <w:r>
-        <w:rPr>
-          <w:rFonts w:eastAsia="Aptos" w:cs="Aptos" w:ascii="Aptos" w:hAnsi="Aptos"/>
-          <w:b/>
-          <w:sz w:val="24"/>
-        </w:rPr>
-        <w:t xml:space="preserve"> </w:t>
-      </w:r>
-    </w:p>
-    <w:p>
-      <w:pPr>
-        <w:pStyle w:val="Normal"/>
-        <w:spacing w:before="0" w:after="0"/>
-        <w:rPr/>
-      </w:pPr>
-      <w:r>
-        <w:rPr>
-          <w:rFonts w:eastAsia="Aptos" w:cs="Aptos" w:ascii="Aptos" w:hAnsi="Aptos"/>
-          <w:b/>
-          <w:sz w:val="24"/>
-        </w:rPr>
-        <w:t xml:space="preserve"> </w:t>
-      </w:r>
-    </w:p>
-    <w:p>
-      <w:pPr>
-        <w:pStyle w:val="Normal"/>
-        <w:spacing w:before="0" w:after="0"/>
-        <w:rPr/>
-      </w:pPr>
-      <w:r>
-        <w:rPr>
-          <w:rFonts w:eastAsia="Aptos" w:cs="Aptos" w:ascii="Aptos" w:hAnsi="Aptos"/>
-          <w:b/>
-          <w:sz w:val="24"/>
-        </w:rPr>
-        <w:t xml:space="preserve"> </w:t>
-      </w:r>
-    </w:p>
-    <w:p>
-      <w:pPr>
-        <w:pStyle w:val="Normal"/>
-        <w:spacing w:before="0" w:after="0"/>
-        <w:rPr/>
-      </w:pPr>
-      <w:r>
-        <w:rPr>
-          <w:rFonts w:eastAsia="Aptos" w:cs="Aptos" w:ascii="Aptos" w:hAnsi="Aptos"/>
-          <w:b/>
-          <w:sz w:val="24"/>
-        </w:rPr>
-        <w:t xml:space="preserve"> </w:t>
-      </w:r>
-    </w:p>
-    <w:p>
-      <w:pPr>
-        <w:pStyle w:val="Normal"/>
-        <w:spacing w:before="0" w:after="0"/>
-        <w:rPr/>
-      </w:pPr>
-      <w:r>
-        <w:rPr>
-          <w:rFonts w:eastAsia="Aptos" w:cs="Aptos" w:ascii="Aptos" w:hAnsi="Aptos"/>
-          <w:b/>
-          <w:sz w:val="24"/>
-        </w:rPr>
-        <w:t xml:space="preserve"> </w:t>
-      </w:r>
-    </w:p>
-    <w:p>
-      <w:pPr>
-        <w:pStyle w:val="Normal"/>
-        <w:spacing w:before="0" w:after="3"/>
-        <w:ind w:left="-5" w:hanging="10"/>
-        <w:rPr/>
-      </w:pPr>
-      <w:r>
-        <w:rPr>
-          <w:rFonts w:eastAsia="Aptos" w:cs="Aptos" w:ascii="Aptos" w:hAnsi="Aptos"/>
-          <w:b/>
-          <w:sz w:val="24"/>
-        </w:rPr>
-        <w:t xml:space="preserve">Sep 2012 - Sep 2014 </w:t>
-      </w:r>
-    </w:p>
-    <w:p>
-      <w:pPr>
-        <w:pStyle w:val="Heading2"/>
-        <w:ind w:left="-5" w:hanging="10"/>
-        <w:rPr/>
-      </w:pPr>
-      <w:r>
-        <w:rPr/>
-        <w:t>Developer| SHRIRAM VALUE SERVICES PVT LTD</w:t>
-      </w:r>
-      <w:r>
-        <w:rPr>
-          <w:color w:val="404040"/>
-        </w:rPr>
-        <w:t xml:space="preserve"> </w:t>
-      </w:r>
-      <w:r>
-        <w:rPr/>
-        <w:t xml:space="preserve">| Chennai </w:t>
-      </w:r>
-    </w:p>
-    <w:p>
-      <w:pPr>
-        <w:pStyle w:val="Normal"/>
-        <w:numPr>
-          <w:ilvl w:val="0"/>
-          <w:numId w:val="6"/>
-        </w:numPr>
-        <w:spacing w:lineRule="auto" w:line="252" w:before="0" w:after="3"/>
-        <w:ind w:left="1081" w:hanging="360"/>
-        <w:rPr/>
-      </w:pPr>
-      <w:r>
-        <w:rPr>
-          <w:rFonts w:eastAsia="Aptos" w:cs="Aptos" w:ascii="Aptos" w:hAnsi="Aptos"/>
-          <w:sz w:val="24"/>
-        </w:rPr>
-        <w:t>Requirements gathering and translating it into design document.</w:t>
-      </w:r>
-      <w:r>
-        <w:rPr>
-          <w:rFonts w:eastAsia="Aptos" w:cs="Aptos" w:ascii="Aptos" w:hAnsi="Aptos"/>
-          <w:color w:val="404040"/>
-          <w:sz w:val="20"/>
-        </w:rPr>
-        <w:t xml:space="preserve"> </w:t>
-      </w:r>
-    </w:p>
-    <w:p>
-      <w:pPr>
-        <w:pStyle w:val="Normal"/>
-        <w:numPr>
-          <w:ilvl w:val="0"/>
-          <w:numId w:val="6"/>
-        </w:numPr>
-        <w:spacing w:lineRule="auto" w:line="252" w:before="0" w:after="3"/>
-        <w:ind w:left="1081" w:hanging="360"/>
-        <w:rPr/>
-      </w:pPr>
-      <w:r>
-        <w:rPr>
-          <w:rFonts w:eastAsia="Aptos" w:cs="Aptos" w:ascii="Aptos" w:hAnsi="Aptos"/>
-          <w:sz w:val="24"/>
-        </w:rPr>
-        <w:t xml:space="preserve">Code design, unit testing and Implementation. </w:t>
-      </w:r>
-    </w:p>
-    <w:p>
-      <w:pPr>
-        <w:pStyle w:val="Normal"/>
-        <w:numPr>
-          <w:ilvl w:val="0"/>
-          <w:numId w:val="6"/>
-        </w:numPr>
-        <w:spacing w:lineRule="auto" w:line="252" w:before="0" w:after="3"/>
-        <w:ind w:left="1081" w:hanging="360"/>
-        <w:rPr/>
-      </w:pPr>
-      <w:r>
-        <w:rPr>
-          <w:rFonts w:eastAsia="Aptos" w:cs="Aptos" w:ascii="Aptos" w:hAnsi="Aptos"/>
-          <w:sz w:val="24"/>
-        </w:rPr>
-        <w:t xml:space="preserve">Supported system and UA testing of the programs/fixes that were released for testing. </w:t>
-      </w:r>
-    </w:p>
-    <w:p>
-      <w:pPr>
-        <w:pStyle w:val="Normal"/>
-        <w:numPr>
-          <w:ilvl w:val="0"/>
-          <w:numId w:val="6"/>
-        </w:numPr>
-        <w:spacing w:lineRule="auto" w:line="252" w:before="0" w:after="3"/>
-        <w:ind w:left="1081" w:hanging="360"/>
-        <w:rPr/>
-      </w:pPr>
-      <w:r>
-        <w:rPr>
-          <w:rFonts w:eastAsia="Aptos" w:cs="Aptos" w:ascii="Aptos" w:hAnsi="Aptos"/>
-          <w:sz w:val="24"/>
-        </w:rPr>
-        <w:t xml:space="preserve">User manual and End-user training are conducted. </w:t>
-      </w:r>
-    </w:p>
-    <w:p>
-      <w:pPr>
-        <w:pStyle w:val="Normal"/>
-        <w:spacing w:before="0" w:after="0"/>
-        <w:rPr/>
-      </w:pPr>
-      <w:r>
-        <w:rPr>
-          <w:rFonts w:eastAsia="Aptos" w:cs="Aptos" w:ascii="Aptos" w:hAnsi="Aptos"/>
-          <w:sz w:val="24"/>
-        </w:rPr>
-        <w:t xml:space="preserve"> </w:t>
-      </w:r>
-    </w:p>
-    <w:p>
-      <w:pPr>
-        <w:pStyle w:val="Normal"/>
-        <w:spacing w:before="0" w:after="3"/>
-        <w:ind w:left="-5" w:hanging="10"/>
-        <w:rPr/>
-      </w:pPr>
-      <w:r>
-        <w:rPr>
-          <w:rFonts w:eastAsia="Aptos" w:cs="Aptos" w:ascii="Aptos" w:hAnsi="Aptos"/>
-          <w:b/>
-          <w:sz w:val="24"/>
-        </w:rPr>
-        <w:t xml:space="preserve">Feb 2012 - May 2012 </w:t>
-      </w:r>
-    </w:p>
-    <w:p>
-      <w:pPr>
-        <w:pStyle w:val="Heading2"/>
-        <w:ind w:left="-5" w:hanging="10"/>
-        <w:rPr/>
-      </w:pPr>
-      <w:r>
-        <w:rPr/>
-        <w:t xml:space="preserve">Developer| SUKHVARSHA MANAGEMENT SERVICES PVT LTD | Chennai </w:t>
-      </w:r>
-    </w:p>
-    <w:p>
-      <w:pPr>
-        <w:pStyle w:val="Normal"/>
-        <w:numPr>
-          <w:ilvl w:val="0"/>
-          <w:numId w:val="7"/>
-        </w:numPr>
-        <w:spacing w:lineRule="auto" w:line="252" w:before="0" w:after="3"/>
-        <w:ind w:left="706" w:hanging="360"/>
-        <w:rPr/>
-      </w:pPr>
-      <w:r>
-        <w:rPr>
-          <w:rFonts w:eastAsia="Aptos" w:cs="Aptos" w:ascii="Aptos" w:hAnsi="Aptos"/>
-          <w:sz w:val="24"/>
-        </w:rPr>
-        <w:t>Requirements gathering and translating it into design document.</w:t>
-      </w:r>
-      <w:r>
-        <w:rPr>
-          <w:rFonts w:eastAsia="Aptos" w:cs="Aptos" w:ascii="Aptos" w:hAnsi="Aptos"/>
-          <w:color w:val="404040"/>
-          <w:sz w:val="20"/>
-        </w:rPr>
-        <w:t xml:space="preserve"> </w:t>
-      </w:r>
-    </w:p>
-    <w:p>
-      <w:pPr>
-        <w:pStyle w:val="Normal"/>
-        <w:numPr>
-          <w:ilvl w:val="0"/>
-          <w:numId w:val="7"/>
-        </w:numPr>
-        <w:spacing w:lineRule="auto" w:line="252" w:before="0" w:after="3"/>
-        <w:ind w:left="706" w:hanging="360"/>
-        <w:rPr/>
-      </w:pPr>
-      <w:r>
-        <w:rPr>
-          <w:rFonts w:eastAsia="Aptos" w:cs="Aptos" w:ascii="Aptos" w:hAnsi="Aptos"/>
-          <w:sz w:val="24"/>
-        </w:rPr>
-        <w:t>Code design, unit testing and Implementation.</w:t>
-      </w:r>
-      <w:r>
-        <w:rPr>
-          <w:rFonts w:eastAsia="Aptos" w:cs="Aptos" w:ascii="Aptos" w:hAnsi="Aptos"/>
-          <w:color w:val="404040"/>
-          <w:sz w:val="20"/>
-        </w:rPr>
-        <w:t xml:space="preserve"> </w:t>
-      </w:r>
-    </w:p>
-    <w:p>
-      <w:pPr>
-        <w:pStyle w:val="Normal"/>
-        <w:numPr>
-          <w:ilvl w:val="0"/>
-          <w:numId w:val="7"/>
-        </w:numPr>
-        <w:spacing w:lineRule="auto" w:line="228" w:before="0" w:after="1"/>
-        <w:ind w:left="706" w:hanging="360"/>
-        <w:rPr/>
-      </w:pPr>
-      <w:r>
-        <w:rPr>
-          <w:rFonts w:eastAsia="Aptos" w:cs="Aptos" w:ascii="Aptos" w:hAnsi="Aptos"/>
-          <w:sz w:val="24"/>
-        </w:rPr>
-        <w:t>Deployment of support activities in Production. Developed and modified programs based on business requirements, ensuring alignment with client needs and delivering measurable improvements in project efficiency.</w:t>
-      </w:r>
-      <w:r>
-        <w:rPr>
-          <w:rFonts w:eastAsia="Aptos" w:cs="Aptos" w:ascii="Aptos" w:hAnsi="Aptos"/>
-          <w:color w:val="404040"/>
-          <w:sz w:val="20"/>
-        </w:rPr>
-        <w:t xml:space="preserve"> </w:t>
-      </w:r>
-    </w:p>
-    <w:p>
-      <w:pPr>
-        <w:pStyle w:val="Normal"/>
-        <w:numPr>
-          <w:ilvl w:val="0"/>
-          <w:numId w:val="7"/>
-        </w:numPr>
-        <w:spacing w:lineRule="auto" w:line="252" w:before="0" w:after="3"/>
-        <w:ind w:left="706" w:hanging="360"/>
-        <w:rPr/>
-      </w:pPr>
-      <w:r>
-        <w:rPr>
-          <w:rFonts w:eastAsia="Aptos" w:cs="Aptos" w:ascii="Aptos" w:hAnsi="Aptos"/>
-          <w:sz w:val="24"/>
-        </w:rPr>
-        <w:t>Supported system and UA testing of the programs/fixes that were released for testing.</w:t>
-      </w:r>
-      <w:r>
-        <w:rPr>
-          <w:rFonts w:eastAsia="Aptos" w:cs="Aptos" w:ascii="Aptos" w:hAnsi="Aptos"/>
-          <w:color w:val="404040"/>
-          <w:sz w:val="20"/>
-        </w:rPr>
-        <w:t xml:space="preserve"> </w:t>
-      </w:r>
-    </w:p>
-    <w:p>
-      <w:pPr>
-        <w:pStyle w:val="Normal"/>
-        <w:numPr>
-          <w:ilvl w:val="0"/>
-          <w:numId w:val="7"/>
-        </w:numPr>
-        <w:spacing w:lineRule="auto" w:line="252" w:before="0" w:after="3"/>
-        <w:ind w:left="706" w:hanging="360"/>
-        <w:rPr/>
-      </w:pPr>
-      <w:r>
-        <w:rPr>
-          <w:rFonts w:eastAsia="Aptos" w:cs="Aptos" w:ascii="Aptos" w:hAnsi="Aptos"/>
-          <w:sz w:val="24"/>
-        </w:rPr>
-        <w:t>User manual and End-user training are conducted.</w:t>
-      </w:r>
-      <w:r>
-        <w:rPr>
-          <w:rFonts w:eastAsia="Aptos" w:cs="Aptos" w:ascii="Aptos" w:hAnsi="Aptos"/>
-          <w:color w:val="404040"/>
-          <w:sz w:val="20"/>
-        </w:rPr>
-        <w:t xml:space="preserve"> </w:t>
-      </w:r>
-    </w:p>
-    <w:p>
-      <w:pPr>
-        <w:pStyle w:val="Normal"/>
-        <w:spacing w:before="0" w:after="0"/>
-        <w:rPr/>
-      </w:pPr>
-      <w:r>
-        <w:rPr>
-          <w:rFonts w:eastAsia="Aptos" w:cs="Aptos" w:ascii="Aptos" w:hAnsi="Aptos"/>
-          <w:sz w:val="24"/>
-        </w:rPr>
-        <w:t xml:space="preserve"> </w:t>
-      </w:r>
-    </w:p>
-    <w:p>
-      <w:pPr>
-        <w:pStyle w:val="Normal"/>
-        <w:spacing w:before="0" w:after="3"/>
-        <w:ind w:left="-5" w:hanging="10"/>
-        <w:rPr/>
-      </w:pPr>
-      <w:r>
-        <w:rPr>
-          <w:rFonts w:eastAsia="Aptos" w:cs="Aptos" w:ascii="Aptos" w:hAnsi="Aptos"/>
-          <w:b/>
-          <w:sz w:val="24"/>
-        </w:rPr>
-        <w:t>Feb 2011 - Feb 2012</w:t>
-      </w:r>
-      <w:r>
-        <w:rPr>
-          <w:rFonts w:eastAsia="Aptos" w:cs="Aptos" w:ascii="Aptos" w:hAnsi="Aptos"/>
-          <w:b/>
-          <w:color w:val="404040"/>
-          <w:sz w:val="24"/>
-        </w:rPr>
-        <w:t xml:space="preserve"> </w:t>
-      </w:r>
-    </w:p>
-    <w:p>
-      <w:pPr>
-        <w:pStyle w:val="Heading2"/>
-        <w:ind w:left="-5" w:hanging="10"/>
-        <w:rPr/>
-      </w:pPr>
-      <w:r>
-        <w:rPr/>
-        <w:t xml:space="preserve">Developer| ZENTA KNOWLEDGE SERVICES PVT LTD | Chennai </w:t>
-      </w:r>
-    </w:p>
-    <w:p>
-      <w:pPr>
-        <w:pStyle w:val="Normal"/>
-        <w:numPr>
-          <w:ilvl w:val="0"/>
-          <w:numId w:val="8"/>
-        </w:numPr>
-        <w:spacing w:lineRule="auto" w:line="252" w:before="0" w:after="3"/>
-        <w:ind w:left="706" w:hanging="360"/>
-        <w:rPr/>
-      </w:pPr>
-      <w:r>
-        <w:rPr>
-          <w:rFonts w:eastAsia="Aptos" w:cs="Aptos" w:ascii="Aptos" w:hAnsi="Aptos"/>
-          <w:sz w:val="24"/>
-        </w:rPr>
-        <w:t xml:space="preserve">Requirements gathering and translating it into design document. </w:t>
-      </w:r>
-    </w:p>
-    <w:p>
-      <w:pPr>
-        <w:pStyle w:val="Normal"/>
-        <w:numPr>
-          <w:ilvl w:val="0"/>
-          <w:numId w:val="8"/>
-        </w:numPr>
-        <w:spacing w:lineRule="auto" w:line="252" w:before="0" w:after="3"/>
-        <w:ind w:left="706" w:hanging="360"/>
-        <w:rPr/>
-      </w:pPr>
-      <w:r>
-        <w:rPr>
-          <w:rFonts w:eastAsia="Aptos" w:cs="Aptos" w:ascii="Aptos" w:hAnsi="Aptos"/>
-          <w:sz w:val="24"/>
-        </w:rPr>
-        <w:t xml:space="preserve">Code design, unit testing and Implementation. </w:t>
-      </w:r>
-    </w:p>
-    <w:p>
-      <w:pPr>
-        <w:pStyle w:val="Normal"/>
-        <w:numPr>
-          <w:ilvl w:val="0"/>
-          <w:numId w:val="8"/>
-        </w:numPr>
-        <w:spacing w:lineRule="auto" w:line="252" w:before="0" w:after="3"/>
-        <w:ind w:left="706" w:hanging="360"/>
-        <w:rPr/>
-      </w:pPr>
-      <w:r>
-        <w:rPr>
-          <w:rFonts w:eastAsia="Aptos" w:cs="Aptos" w:ascii="Aptos" w:hAnsi="Aptos"/>
-          <w:sz w:val="24"/>
-        </w:rPr>
-        <w:t xml:space="preserve">Supported System and UAT testing of the programs/fixes in Releases. </w:t>
-      </w:r>
-    </w:p>
-    <w:p>
-      <w:pPr>
-        <w:pStyle w:val="Normal"/>
-        <w:numPr>
-          <w:ilvl w:val="0"/>
-          <w:numId w:val="8"/>
-        </w:numPr>
-        <w:spacing w:lineRule="auto" w:line="252" w:before="0" w:after="3"/>
-        <w:ind w:left="706" w:hanging="360"/>
-        <w:rPr/>
-      </w:pPr>
-      <w:r>
-        <w:rPr>
-          <w:rFonts w:eastAsia="Aptos" w:cs="Aptos" w:ascii="Aptos" w:hAnsi="Aptos"/>
-          <w:sz w:val="24"/>
-        </w:rPr>
-        <w:t xml:space="preserve">User manual and End-user training are conducted. </w:t>
-      </w:r>
-    </w:p>
-    <w:p>
-      <w:pPr>
-        <w:pStyle w:val="Normal"/>
-        <w:spacing w:before="0" w:after="0"/>
-        <w:rPr/>
-      </w:pPr>
-      <w:r>
-        <w:rPr>
-          <w:rFonts w:eastAsia="Aptos" w:cs="Aptos" w:ascii="Aptos" w:hAnsi="Aptos"/>
-          <w:sz w:val="24"/>
-        </w:rPr>
-        <w:t xml:space="preserve"> </w:t>
-      </w:r>
-    </w:p>
-    <w:p>
-      <w:pPr>
-        <w:pStyle w:val="Heading2"/>
-        <w:ind w:left="-5" w:hanging="10"/>
-        <w:rPr/>
-      </w:pPr>
-      <w:r>
-        <w:rPr/>
-        <w:t>Dec 2009 - Feb 2011</w:t>
-      </w:r>
-      <w:r>
-        <w:rPr>
-          <w:color w:val="404040"/>
-        </w:rPr>
-        <w:t xml:space="preserve"> </w:t>
-      </w:r>
-    </w:p>
-    <w:p>
-      <w:pPr>
-        <w:pStyle w:val="Normal"/>
-        <w:spacing w:lineRule="auto" w:line="252" w:before="0" w:after="3"/>
-        <w:ind w:left="361" w:right="2378" w:hanging="361"/>
-        <w:rPr/>
-      </w:pPr>
-      <w:r>
-        <w:rPr>
-          <w:rFonts w:eastAsia="Aptos" w:cs="Aptos" w:ascii="Aptos" w:hAnsi="Aptos"/>
-          <w:b/>
-          <w:sz w:val="24"/>
-        </w:rPr>
-        <w:t xml:space="preserve">Developer| FUTURE TEC TECHNOLOGIES PVT LTD | Chennai </w:t>
-      </w:r>
-      <w:r>
-        <w:rPr>
-          <w:rFonts w:eastAsia="Segoe UI Symbol" w:cs="Segoe UI Symbol" w:ascii="Segoe UI Symbol" w:hAnsi="Segoe UI Symbol"/>
-          <w:sz w:val="24"/>
-        </w:rPr>
-        <w:t>•</w:t>
-      </w:r>
-      <w:r>
-        <w:rPr>
-          <w:rFonts w:eastAsia="Arial" w:cs="Arial" w:ascii="Arial" w:hAnsi="Arial"/>
-          <w:sz w:val="24"/>
-        </w:rPr>
-        <w:t xml:space="preserve"> </w:t>
-      </w:r>
-      <w:r>
-        <w:rPr>
-          <w:rFonts w:eastAsia="Aptos" w:cs="Aptos" w:ascii="Aptos" w:hAnsi="Aptos"/>
-          <w:sz w:val="24"/>
-        </w:rPr>
-        <w:t xml:space="preserve">Requirements gathering and translating it into design document. </w:t>
-      </w:r>
-    </w:p>
-    <w:p>
-      <w:pPr>
-        <w:pStyle w:val="Normal"/>
-        <w:numPr>
-          <w:ilvl w:val="0"/>
-          <w:numId w:val="9"/>
-        </w:numPr>
-        <w:spacing w:lineRule="auto" w:line="252" w:before="0" w:after="3"/>
-        <w:ind w:left="706" w:hanging="360"/>
-        <w:rPr/>
-      </w:pPr>
-      <w:r>
-        <w:rPr>
-          <w:rFonts w:eastAsia="Aptos" w:cs="Aptos" w:ascii="Aptos" w:hAnsi="Aptos"/>
-          <w:sz w:val="24"/>
-        </w:rPr>
-        <w:t xml:space="preserve">Code design, unit testing and Implementation. </w:t>
-      </w:r>
-    </w:p>
-    <w:p>
-      <w:pPr>
-        <w:pStyle w:val="Normal"/>
-        <w:numPr>
-          <w:ilvl w:val="0"/>
-          <w:numId w:val="9"/>
-        </w:numPr>
-        <w:spacing w:lineRule="auto" w:line="252" w:before="0" w:after="3"/>
-        <w:ind w:left="706" w:hanging="360"/>
-        <w:rPr/>
-      </w:pPr>
-      <w:r>
-        <w:rPr>
-          <w:rFonts w:eastAsia="Aptos" w:cs="Aptos" w:ascii="Aptos" w:hAnsi="Aptos"/>
-          <w:sz w:val="24"/>
-        </w:rPr>
-        <w:t xml:space="preserve">Supported system and UA testing of the programs/fixes that were released for testing. </w:t>
-      </w:r>
-    </w:p>
-    <w:p>
-      <w:pPr>
-        <w:pStyle w:val="Normal"/>
-        <w:numPr>
-          <w:ilvl w:val="0"/>
-          <w:numId w:val="9"/>
-        </w:numPr>
-        <w:spacing w:lineRule="auto" w:line="252" w:before="0" w:after="3"/>
-        <w:ind w:left="706" w:hanging="360"/>
-        <w:rPr/>
-      </w:pPr>
-      <w:r>
-        <w:rPr>
-          <w:rFonts w:eastAsia="Aptos" w:cs="Aptos" w:ascii="Aptos" w:hAnsi="Aptos"/>
-          <w:sz w:val="24"/>
-        </w:rPr>
-        <w:t xml:space="preserve">User manual and End-user training are conducted. </w:t>
-      </w:r>
-    </w:p>
     <w:sectPr>
-      <w:type w:val="continuous"/>
+      <w:type w:val="nextPage"/>
       <w:pgSz w:w="12240" w:h="15840"/>
       <w:pgMar w:left="1441" w:right="1128" w:gutter="0" w:header="0" w:top="1108" w:footer="0" w:bottom="1143"/>
+      <w:pgNumType w:fmt="decimal"/>
       <w:formProt w:val="false"/>
       <w:textDirection w:val="lrTb"/>
       <w:docGrid w:type="default" w:linePitch="100" w:charSpace="0"/>

</xml_diff>